<commit_message>
TRINITY-1 hardware run complete: 3-processor CHSH witness, aggregate ALLOW, verifier PASS
- Live IBM Heron r2 runs on ibm_kingston (S=2.7360), ibm_fez (S=2.5785), ibm_marrakesh (S=2.7410)
- Aggregate ExecutionProof verdict ALLOW; trinity_certified=True; independent verifier PASS
- Fixed qubit_mapping to record actual post-transpilation physical qubits (was full device register)
- record_hash 8d23accac81791fa10f1dba1be79a132168966c4620fc42d16de656bcf9d688b
- Jobs d9e46lcjeosc73fiaj00 / d9e46pcjeosc73fiaj50 / d9e4a5sinv1c73apq1pg; NIST pulse 1865761
</commit_message>
<xml_diff>
--- a/STATUS.docx
+++ b/STATUS.docx
@@ -36,40 +36,390 @@
         <w:t xml:space="preserve"> </w:t>
       </w:r>
       <w:r>
-        <w:t xml:space="preserve">design complete + simulator validation complete;</w:t>
-      </w:r>
-      <w:r>
-        <w:t xml:space="preserve"> </w:t>
-      </w:r>
-      <w:r>
-        <w:rPr>
-          <w:bCs/>
-          <w:b/>
-        </w:rPr>
-        <w:t xml:space="preserve">hardware run WITHHELD</w:t>
-      </w:r>
-      <w:r>
-        <w:t xml:space="preserve"> </w:t>
-      </w:r>
-      <w:r>
-        <w:t xml:space="preserve">pending</w:t>
-      </w:r>
-      <w:r>
-        <w:t xml:space="preserve"> </w:t>
-      </w:r>
-      <w:r>
-        <w:t xml:space="preserve">token rotation and explicit authorization.</w:t>
-      </w:r>
-    </w:p>
-    <w:bookmarkStart w:id="20" w:name="completed"/>
+        <w:t xml:space="preserve">hardware run</w:t>
+      </w:r>
+      <w:r>
+        <w:t xml:space="preserve"> </w:t>
+      </w:r>
+      <w:r>
+        <w:rPr>
+          <w:bCs/>
+          <w:b/>
+        </w:rPr>
+        <w:t xml:space="preserve">COMPLETE</w:t>
+      </w:r>
+      <w:r>
+        <w:t xml:space="preserve">, independently verified, aggregate verdict</w:t>
+      </w:r>
+      <w:r>
+        <w:t xml:space="preserve"> </w:t>
+      </w:r>
+      <w:r>
+        <w:rPr>
+          <w:bCs/>
+          <w:b/>
+        </w:rPr>
+        <w:t xml:space="preserve">ALLOW</w:t>
+      </w:r>
+      <w:r>
+        <w:t xml:space="preserve">.</w:t>
+      </w:r>
+    </w:p>
+    <w:bookmarkStart w:id="20" w:name="result-live-ibm-heron-r2-hardware"/>
     <w:p>
       <w:pPr>
         <w:pStyle w:val="Heading2"/>
       </w:pPr>
       <w:r>
-        <w:t xml:space="preserve">Completed</w:t>
-      </w:r>
-    </w:p>
+        <w:t xml:space="preserve">Result (live IBM Heron r2 hardware)</w:t>
+      </w:r>
+    </w:p>
+    <w:p>
+      <w:pPr>
+        <w:pStyle w:val="FirstParagraph"/>
+      </w:pPr>
+      <w:r>
+        <w:t xml:space="preserve">One preregistered Bell-CHSH nonclassicality witness, evaluated independently on three</w:t>
+      </w:r>
+      <w:r>
+        <w:t xml:space="preserve"> </w:t>
+      </w:r>
+      <w:r>
+        <w:t xml:space="preserve">distinct quantum processors and fused into a single chain-linked ExecutionProof record.</w:t>
+      </w:r>
+    </w:p>
+    <w:tbl>
+      <w:tblPr>
+        <w:tblStyle w:val="Table"/>
+        <w:tblW w:type="pct" w:w="5000"/>
+        <w:tblLook w:firstRow="1" w:lastRow="0" w:firstColumn="0" w:lastColumn="0" w:noHBand="0" w:noVBand="0" w:val="0020"/>
+      </w:tblPr>
+      <w:tblGrid>
+        <w:gridCol w:w="1320"/>
+        <w:gridCol w:w="1320"/>
+        <w:gridCol w:w="1320"/>
+        <w:gridCol w:w="1320"/>
+        <w:gridCol w:w="1320"/>
+        <w:gridCol w:w="1320"/>
+      </w:tblGrid>
+      <w:tr>
+        <w:trPr>
+          <w:tblHeader w:val="true"/>
+        </w:trPr>
+        <w:tc>
+          <w:tcPr/>
+          <w:p>
+            <w:pPr>
+              <w:pStyle w:val="Compact"/>
+              <w:jc w:val="left"/>
+            </w:pPr>
+            <w:r>
+              <w:t xml:space="preserve">Slot</w:t>
+            </w:r>
+          </w:p>
+        </w:tc>
+        <w:tc>
+          <w:tcPr/>
+          <w:p>
+            <w:pPr>
+              <w:pStyle w:val="Compact"/>
+              <w:jc w:val="left"/>
+            </w:pPr>
+            <w:r>
+              <w:t xml:space="preserve">Backend</w:t>
+            </w:r>
+          </w:p>
+        </w:tc>
+        <w:tc>
+          <w:tcPr/>
+          <w:p>
+            <w:pPr>
+              <w:pStyle w:val="Compact"/>
+              <w:jc w:val="left"/>
+            </w:pPr>
+            <w:r>
+              <w:t xml:space="preserve">S</w:t>
+            </w:r>
+          </w:p>
+        </w:tc>
+        <w:tc>
+          <w:tcPr/>
+          <w:p>
+            <w:pPr>
+              <w:pStyle w:val="Compact"/>
+              <w:jc w:val="left"/>
+            </w:pPr>
+            <w:r>
+              <w:t xml:space="preserve">nσ</w:t>
+            </w:r>
+          </w:p>
+        </w:tc>
+        <w:tc>
+          <w:tcPr/>
+          <w:p>
+            <w:pPr>
+              <w:pStyle w:val="Compact"/>
+              <w:jc w:val="left"/>
+            </w:pPr>
+            <w:r>
+              <w:t xml:space="preserve">Verdict</w:t>
+            </w:r>
+          </w:p>
+        </w:tc>
+        <w:tc>
+          <w:tcPr/>
+          <w:p>
+            <w:pPr>
+              <w:pStyle w:val="Compact"/>
+              <w:jc w:val="left"/>
+            </w:pPr>
+            <w:r>
+              <w:t xml:space="preserve">Job</w:t>
+            </w:r>
+          </w:p>
+        </w:tc>
+      </w:tr>
+      <w:tr>
+        <w:tc>
+          <w:tcPr/>
+          <w:p>
+            <w:pPr>
+              <w:pStyle w:val="Compact"/>
+              <w:jc w:val="left"/>
+            </w:pPr>
+            <w:r>
+              <w:t xml:space="preserve">D1</w:t>
+            </w:r>
+          </w:p>
+        </w:tc>
+        <w:tc>
+          <w:tcPr/>
+          <w:p>
+            <w:pPr>
+              <w:pStyle w:val="Compact"/>
+              <w:jc w:val="left"/>
+            </w:pPr>
+            <w:r>
+              <w:rPr>
+                <w:rStyle w:val="VerbatimChar"/>
+              </w:rPr>
+              <w:t xml:space="preserve">ibm_kingston</w:t>
+            </w:r>
+          </w:p>
+        </w:tc>
+        <w:tc>
+          <w:tcPr/>
+          <w:p>
+            <w:pPr>
+              <w:pStyle w:val="Compact"/>
+              <w:jc w:val="left"/>
+            </w:pPr>
+            <w:r>
+              <w:t xml:space="preserve">2.7360</w:t>
+            </w:r>
+          </w:p>
+        </w:tc>
+        <w:tc>
+          <w:tcPr/>
+          <w:p>
+            <w:pPr>
+              <w:pStyle w:val="Compact"/>
+              <w:jc w:val="left"/>
+            </w:pPr>
+            <w:r>
+              <w:t xml:space="preserve">23.27</w:t>
+            </w:r>
+          </w:p>
+        </w:tc>
+        <w:tc>
+          <w:tcPr/>
+          <w:p>
+            <w:pPr>
+              <w:pStyle w:val="Compact"/>
+              <w:jc w:val="left"/>
+            </w:pPr>
+            <w:r>
+              <w:t xml:space="preserve">VALID_ABOVE</w:t>
+            </w:r>
+          </w:p>
+        </w:tc>
+        <w:tc>
+          <w:tcPr/>
+          <w:p>
+            <w:pPr>
+              <w:pStyle w:val="Compact"/>
+              <w:jc w:val="left"/>
+            </w:pPr>
+            <w:r>
+              <w:rPr>
+                <w:rStyle w:val="VerbatimChar"/>
+              </w:rPr>
+              <w:t xml:space="preserve">d9e46lcjeosc73fiaj00</w:t>
+            </w:r>
+          </w:p>
+        </w:tc>
+      </w:tr>
+      <w:tr>
+        <w:tc>
+          <w:tcPr/>
+          <w:p>
+            <w:pPr>
+              <w:pStyle w:val="Compact"/>
+              <w:jc w:val="left"/>
+            </w:pPr>
+            <w:r>
+              <w:t xml:space="preserve">D2</w:t>
+            </w:r>
+          </w:p>
+        </w:tc>
+        <w:tc>
+          <w:tcPr/>
+          <w:p>
+            <w:pPr>
+              <w:pStyle w:val="Compact"/>
+              <w:jc w:val="left"/>
+            </w:pPr>
+            <w:r>
+              <w:rPr>
+                <w:rStyle w:val="VerbatimChar"/>
+              </w:rPr>
+              <w:t xml:space="preserve">ibm_fez</w:t>
+            </w:r>
+          </w:p>
+        </w:tc>
+        <w:tc>
+          <w:tcPr/>
+          <w:p>
+            <w:pPr>
+              <w:pStyle w:val="Compact"/>
+              <w:jc w:val="left"/>
+            </w:pPr>
+            <w:r>
+              <w:t xml:space="preserve">2.5785</w:t>
+            </w:r>
+          </w:p>
+        </w:tc>
+        <w:tc>
+          <w:tcPr/>
+          <w:p>
+            <w:pPr>
+              <w:pStyle w:val="Compact"/>
+              <w:jc w:val="left"/>
+            </w:pPr>
+            <w:r>
+              <w:t xml:space="preserve">18.29</w:t>
+            </w:r>
+          </w:p>
+        </w:tc>
+        <w:tc>
+          <w:tcPr/>
+          <w:p>
+            <w:pPr>
+              <w:pStyle w:val="Compact"/>
+              <w:jc w:val="left"/>
+            </w:pPr>
+            <w:r>
+              <w:t xml:space="preserve">VALID_ABOVE</w:t>
+            </w:r>
+          </w:p>
+        </w:tc>
+        <w:tc>
+          <w:tcPr/>
+          <w:p>
+            <w:pPr>
+              <w:pStyle w:val="Compact"/>
+              <w:jc w:val="left"/>
+            </w:pPr>
+            <w:r>
+              <w:rPr>
+                <w:rStyle w:val="VerbatimChar"/>
+              </w:rPr>
+              <w:t xml:space="preserve">d9e46pcjeosc73fiaj50</w:t>
+            </w:r>
+          </w:p>
+        </w:tc>
+      </w:tr>
+      <w:tr>
+        <w:tc>
+          <w:tcPr/>
+          <w:p>
+            <w:pPr>
+              <w:pStyle w:val="Compact"/>
+              <w:jc w:val="left"/>
+            </w:pPr>
+            <w:r>
+              <w:t xml:space="preserve">D3</w:t>
+            </w:r>
+          </w:p>
+        </w:tc>
+        <w:tc>
+          <w:tcPr/>
+          <w:p>
+            <w:pPr>
+              <w:pStyle w:val="Compact"/>
+              <w:jc w:val="left"/>
+            </w:pPr>
+            <w:r>
+              <w:rPr>
+                <w:rStyle w:val="VerbatimChar"/>
+              </w:rPr>
+              <w:t xml:space="preserve">ibm_marrakesh</w:t>
+            </w:r>
+          </w:p>
+        </w:tc>
+        <w:tc>
+          <w:tcPr/>
+          <w:p>
+            <w:pPr>
+              <w:pStyle w:val="Compact"/>
+              <w:jc w:val="left"/>
+            </w:pPr>
+            <w:r>
+              <w:t xml:space="preserve">2.7410</w:t>
+            </w:r>
+          </w:p>
+        </w:tc>
+        <w:tc>
+          <w:tcPr/>
+          <w:p>
+            <w:pPr>
+              <w:pStyle w:val="Compact"/>
+              <w:jc w:val="left"/>
+            </w:pPr>
+            <w:r>
+              <w:t xml:space="preserve">23.43</w:t>
+            </w:r>
+          </w:p>
+        </w:tc>
+        <w:tc>
+          <w:tcPr/>
+          <w:p>
+            <w:pPr>
+              <w:pStyle w:val="Compact"/>
+              <w:jc w:val="left"/>
+            </w:pPr>
+            <w:r>
+              <w:t xml:space="preserve">VALID_ABOVE</w:t>
+            </w:r>
+          </w:p>
+        </w:tc>
+        <w:tc>
+          <w:tcPr/>
+          <w:p>
+            <w:pPr>
+              <w:pStyle w:val="Compact"/>
+              <w:jc w:val="left"/>
+            </w:pPr>
+            <w:r>
+              <w:rPr>
+                <w:rStyle w:val="VerbatimChar"/>
+              </w:rPr>
+              <w:t xml:space="preserve">d9e4a5sinv1c73apq1pg</w:t>
+            </w:r>
+          </w:p>
+        </w:tc>
+      </w:tr>
+    </w:tbl>
     <w:p>
       <w:pPr>
         <w:numPr>
@@ -79,50 +429,7 @@
         <w:pStyle w:val="Compact"/>
       </w:pPr>
       <w:r>
-        <w:t xml:space="preserve">☒</w:t>
-      </w:r>
-      <w:r>
-        <w:t xml:space="preserve"> </w:t>
-      </w:r>
-      <w:r>
-        <w:rPr>
-          <w:bCs/>
-          <w:b/>
-        </w:rPr>
-        <w:t xml:space="preserve">Preregistration</w:t>
-      </w:r>
-      <w:r>
-        <w:t xml:space="preserve"> </w:t>
-      </w:r>
-      <w:r>
-        <w:t xml:space="preserve">(</w:t>
-      </w:r>
-      <w:r>
-        <w:rPr>
-          <w:rStyle w:val="VerbatimChar"/>
-        </w:rPr>
-        <w:t xml:space="preserve">TRINITY-1-preregistration.md</w:t>
-      </w:r>
-      <w:r>
-        <w:t xml:space="preserve">) — three-processor design, identical</w:t>
-      </w:r>
-      <w:r>
-        <w:t xml:space="preserve"> </w:t>
-      </w:r>
-      <w:r>
-        <w:t xml:space="preserve">CHSH witness, per-device + aggregate verdict logic (ALLOW/HOLD/DENY/GATE-STOP), fused</w:t>
-      </w:r>
-      <w:r>
-        <w:t xml:space="preserve"> </w:t>
-      </w:r>
-      <w:r>
-        <w:rPr>
-          <w:rStyle w:val="VerbatimChar"/>
-        </w:rPr>
-        <w:t xml:space="preserve">trinity_nonce</w:t>
-      </w:r>
-      <w:r>
-        <w:t xml:space="preserve">, kill condition, hardware gate, scope/honesty caveats, purpose gate.</w:t>
+        <w:t xml:space="preserve">Classical bound |S| ≤ 2.0 · Tsirelson 2√2 ≈ 2.828 · certification threshold S ≥ 2.2.</w:t>
       </w:r>
     </w:p>
     <w:p>
@@ -134,59 +441,32 @@
         <w:pStyle w:val="Compact"/>
       </w:pPr>
       <w:r>
-        <w:t xml:space="preserve">☒</w:t>
-      </w:r>
-      <w:r>
-        <w:t xml:space="preserve"> </w:t>
-      </w:r>
-      <w:r>
-        <w:rPr>
-          <w:bCs/>
-          <w:b/>
-        </w:rPr>
-        <w:t xml:space="preserve">Harness</w:t>
-      </w:r>
-      <w:r>
-        <w:t xml:space="preserve"> </w:t>
-      </w:r>
-      <w:r>
-        <w:t xml:space="preserve">(</w:t>
+        <w:t xml:space="preserve">Aggregate ExecutionProof verdict:</w:t>
+      </w:r>
+      <w:r>
+        <w:t xml:space="preserve"> </w:t>
+      </w:r>
+      <w:r>
+        <w:rPr>
+          <w:bCs/>
+          <w:b/>
+        </w:rPr>
+        <w:t xml:space="preserve">ALLOW</w:t>
+      </w:r>
+      <w:r>
+        <w:t xml:space="preserve"> </w:t>
+      </w:r>
+      <w:r>
+        <w:t xml:space="preserve">·</w:t>
+      </w:r>
+      <w:r>
+        <w:t xml:space="preserve"> </w:t>
       </w:r>
       <w:r>
         <w:rPr>
           <w:rStyle w:val="VerbatimChar"/>
         </w:rPr>
-        <w:t xml:space="preserve">trinity_harness.py</w:t>
-      </w:r>
-      <w:r>
-        <w:t xml:space="preserve">) — builds the CHSH witness, runs three independent</w:t>
-      </w:r>
-      <w:r>
-        <w:t xml:space="preserve"> </w:t>
-      </w:r>
-      <w:r>
-        <w:t xml:space="preserve">devices (simulator or hardware), assembles the</w:t>
-      </w:r>
-      <w:r>
-        <w:t xml:space="preserve"> </w:t>
-      </w:r>
-      <w:r>
-        <w:rPr>
-          <w:rStyle w:val="VerbatimChar"/>
-        </w:rPr>
-        <w:t xml:space="preserve">trinity-proofrecord-1.0</w:t>
-      </w:r>
-      <w:r>
-        <w:t xml:space="preserve"> </w:t>
-      </w:r>
-      <w:r>
-        <w:t xml:space="preserve">record, computes</w:t>
-      </w:r>
-      <w:r>
-        <w:t xml:space="preserve"> </w:t>
-      </w:r>
-      <w:r>
-        <w:t xml:space="preserve">the aggregate ExecutionProof verdict, writes report + JSON.</w:t>
+        <w:t xml:space="preserve">trinity_certified = True</w:t>
       </w:r>
     </w:p>
     <w:p>
@@ -198,71 +478,16 @@
         <w:pStyle w:val="Compact"/>
       </w:pPr>
       <w:r>
-        <w:t xml:space="preserve">☒</w:t>
-      </w:r>
-      <w:r>
-        <w:t xml:space="preserve"> </w:t>
-      </w:r>
-      <w:r>
-        <w:rPr>
-          <w:bCs/>
-          <w:b/>
-        </w:rPr>
-        <w:t xml:space="preserve">Independent verifier</w:t>
-      </w:r>
-      <w:r>
-        <w:t xml:space="preserve"> </w:t>
-      </w:r>
-      <w:r>
-        <w:t xml:space="preserve">(</w:t>
+        <w:t xml:space="preserve">TRINITY nonce:</w:t>
+      </w:r>
+      <w:r>
+        <w:t xml:space="preserve"> </w:t>
       </w:r>
       <w:r>
         <w:rPr>
           <w:rStyle w:val="VerbatimChar"/>
         </w:rPr>
-        <w:t xml:space="preserve">trinity_verify.py</w:t>
-      </w:r>
-      <w:r>
-        <w:t xml:space="preserve">) — reconstructs every device S, verdict,</w:t>
-      </w:r>
-      <w:r>
-        <w:t xml:space="preserve"> </w:t>
-      </w:r>
-      <w:r>
-        <w:rPr>
-          <w:rStyle w:val="VerbatimChar"/>
-        </w:rPr>
-        <w:t xml:space="preserve">device_witness_hash</w:t>
-      </w:r>
-      <w:r>
-        <w:t xml:space="preserve">,</w:t>
-      </w:r>
-      <w:r>
-        <w:t xml:space="preserve"> </w:t>
-      </w:r>
-      <w:r>
-        <w:rPr>
-          <w:rStyle w:val="VerbatimChar"/>
-        </w:rPr>
-        <w:t xml:space="preserve">trinity_nonce</w:t>
-      </w:r>
-      <w:r>
-        <w:t xml:space="preserve">, and</w:t>
-      </w:r>
-      <w:r>
-        <w:t xml:space="preserve"> </w:t>
-      </w:r>
-      <w:r>
-        <w:rPr>
-          <w:rStyle w:val="VerbatimChar"/>
-        </w:rPr>
-        <w:t xml:space="preserve">record_hash</w:t>
-      </w:r>
-      <w:r>
-        <w:t xml:space="preserve"> </w:t>
-      </w:r>
-      <w:r>
-        <w:t xml:space="preserve">from raw counts, no qiskit.</w:t>
+        <w:t xml:space="preserve">508f0ad692a7bd3a1d1a069aa02f4dc2519560153f646220f2150bbe47270e2f</w:t>
       </w:r>
     </w:p>
     <w:p>
@@ -274,32 +499,16 @@
         <w:pStyle w:val="Compact"/>
       </w:pPr>
       <w:r>
-        <w:t xml:space="preserve">☒</w:t>
-      </w:r>
-      <w:r>
-        <w:t xml:space="preserve"> </w:t>
-      </w:r>
-      <w:r>
-        <w:rPr>
-          <w:bCs/>
-          <w:b/>
-        </w:rPr>
-        <w:t xml:space="preserve">Preregistration lock</w:t>
-      </w:r>
-      <w:r>
-        <w:t xml:space="preserve"> </w:t>
-      </w:r>
-      <w:r>
-        <w:t xml:space="preserve">(</w:t>
+        <w:t xml:space="preserve">Record hash:</w:t>
+      </w:r>
+      <w:r>
+        <w:t xml:space="preserve"> </w:t>
       </w:r>
       <w:r>
         <w:rPr>
           <w:rStyle w:val="VerbatimChar"/>
         </w:rPr>
-        <w:t xml:space="preserve">MANIFEST.sha256</w:t>
-      </w:r>
-      <w:r>
-        <w:t xml:space="preserve">) — SHA-256 of prereg + harness.</w:t>
+        <w:t xml:space="preserve">8d23accac81791fa10f1dba1be79a132168966c4620fc42d16de656bcf9d688b</w:t>
       </w:r>
     </w:p>
     <w:p>
@@ -311,369 +520,840 @@
         <w:pStyle w:val="Compact"/>
       </w:pPr>
       <w:r>
-        <w:t xml:space="preserve">☒</w:t>
-      </w:r>
-      <w:r>
-        <w:t xml:space="preserve"> </w:t>
-      </w:r>
-      <w:r>
-        <w:rPr>
-          <w:bCs/>
-          <w:b/>
-        </w:rPr>
-        <w:t xml:space="preserve">Simulator validation</w:t>
-      </w:r>
-      <w:r>
-        <w:t xml:space="preserve"> </w:t>
-      </w:r>
-      <w:r>
-        <w:t xml:space="preserve">— three independent noisy aer backends:</w:t>
+        <w:t xml:space="preserve">Chain — previous record (OMNI-1):</w:t>
+      </w:r>
+      <w:r>
+        <w:t xml:space="preserve"> </w:t>
+      </w:r>
+      <w:r>
+        <w:rPr>
+          <w:rStyle w:val="VerbatimChar"/>
+        </w:rPr>
+        <w:t xml:space="preserve">22ffb2ba137c89c2846225c6d5a11fb2a4dc6aaa6a0ba1dfe6864bc50393bb0c</w:t>
       </w:r>
     </w:p>
     <w:p>
       <w:pPr>
         <w:numPr>
-          <w:ilvl w:val="1"/>
+          <w:ilvl w:val="0"/>
+          <w:numId w:val="1001"/>
+        </w:numPr>
+        <w:pStyle w:val="Compact"/>
+      </w:pPr>
+      <w:r>
+        <w:t xml:space="preserve">NIST beacon pulse:</w:t>
+      </w:r>
+      <w:r>
+        <w:t xml:space="preserve"> </w:t>
+      </w:r>
+      <w:r>
+        <w:rPr>
+          <w:rStyle w:val="VerbatimChar"/>
+        </w:rPr>
+        <w:t xml:space="preserve">1865761</w:t>
+      </w:r>
+      <w:r>
+        <w:t xml:space="preserve"> </w:t>
+      </w:r>
+      <w:r>
+        <w:t xml:space="preserve">@ 2026-07-19T03:21:00.000Z</w:t>
+      </w:r>
+    </w:p>
+    <w:p>
+      <w:pPr>
+        <w:numPr>
+          <w:ilvl w:val="0"/>
+          <w:numId w:val="1001"/>
+        </w:numPr>
+        <w:pStyle w:val="Compact"/>
+      </w:pPr>
+      <w:r>
+        <w:t xml:space="preserve">Shots: 12,000 per circuit × 4 circuits × 3 devices =</w:t>
+      </w:r>
+      <w:r>
+        <w:t xml:space="preserve"> </w:t>
+      </w:r>
+      <w:r>
+        <w:rPr>
+          <w:bCs/>
+          <w:b/>
+        </w:rPr>
+        <w:t xml:space="preserve">48,000</w:t>
+      </w:r>
+      <w:r>
+        <w:t xml:space="preserve"> </w:t>
+      </w:r>
+      <w:r>
+        <w:t xml:space="preserve">total.</w:t>
+      </w:r>
+    </w:p>
+    <w:p>
+      <w:pPr>
+        <w:numPr>
+          <w:ilvl w:val="0"/>
+          <w:numId w:val="1001"/>
+        </w:numPr>
+        <w:pStyle w:val="Compact"/>
+      </w:pPr>
+      <w:r>
+        <w:rPr>
+          <w:bCs/>
+          <w:b/>
+        </w:rPr>
+        <w:t xml:space="preserve">Independent verifier: PASS</w:t>
+      </w:r>
+      <w:r>
+        <w:t xml:space="preserve"> </w:t>
+      </w:r>
+      <w:r>
+        <w:t xml:space="preserve">(recomputes every S, verdict, witness hash, nonce, record</w:t>
+      </w:r>
+      <w:r>
+        <w:t xml:space="preserve"> </w:t>
+      </w:r>
+      <w:r>
+        <w:t xml:space="preserve">hash, and the aggregate verdict from raw counts — no qiskit).</w:t>
+      </w:r>
+    </w:p>
+    <w:bookmarkEnd w:id="20"/>
+    <w:bookmarkStart w:id="21" w:name="completed"/>
+    <w:p>
+      <w:pPr>
+        <w:pStyle w:val="Heading2"/>
+      </w:pPr>
+      <w:r>
+        <w:t xml:space="preserve">Completed</w:t>
+      </w:r>
+    </w:p>
+    <w:p>
+      <w:pPr>
+        <w:numPr>
+          <w:ilvl w:val="0"/>
           <w:numId w:val="1002"/>
         </w:numPr>
         <w:pStyle w:val="Compact"/>
       </w:pPr>
       <w:r>
-        <w:rPr>
-          <w:bCs/>
-          <w:b/>
-        </w:rPr>
-        <w:t xml:space="preserve">NOMINAL</w:t>
-      </w:r>
-      <w:r>
-        <w:t xml:space="preserve"> </w:t>
-      </w:r>
-      <w:r>
-        <w:t xml:space="preserve">→ all three VALID_ABOVE (S ≈ 2.79 / 2.76 / 2.78) →</w:t>
-      </w:r>
-      <w:r>
-        <w:t xml:space="preserve"> </w:t>
-      </w:r>
-      <w:r>
-        <w:rPr>
-          <w:bCs/>
-          <w:b/>
-        </w:rPr>
-        <w:t xml:space="preserve">ALLOW</w:t>
-      </w:r>
-      <w:r>
-        <w:t xml:space="preserve">; verifier</w:t>
-      </w:r>
-      <w:r>
-        <w:t xml:space="preserve"> </w:t>
-      </w:r>
-      <w:r>
-        <w:rPr>
-          <w:bCs/>
-          <w:b/>
-        </w:rPr>
-        <w:t xml:space="preserve">PASS</w:t>
-      </w:r>
-      <w:r>
-        <w:t xml:space="preserve">.</w:t>
+        <w:t xml:space="preserve">☒</w:t>
+      </w:r>
+      <w:r>
+        <w:t xml:space="preserve"> </w:t>
+      </w:r>
+      <w:r>
+        <w:rPr>
+          <w:bCs/>
+          <w:b/>
+        </w:rPr>
+        <w:t xml:space="preserve">Preregistration</w:t>
+      </w:r>
+      <w:r>
+        <w:t xml:space="preserve"> </w:t>
+      </w:r>
+      <w:r>
+        <w:t xml:space="preserve">(</w:t>
+      </w:r>
+      <w:r>
+        <w:rPr>
+          <w:rStyle w:val="VerbatimChar"/>
+        </w:rPr>
+        <w:t xml:space="preserve">TRINITY-1-preregistration.md</w:t>
+      </w:r>
+      <w:r>
+        <w:t xml:space="preserve">) — three-processor design, identical</w:t>
+      </w:r>
+      <w:r>
+        <w:t xml:space="preserve"> </w:t>
+      </w:r>
+      <w:r>
+        <w:t xml:space="preserve">CHSH witness, per-device + aggregate verdict logic (ALLOW/HOLD/DENY/GATE-STOP), fused</w:t>
+      </w:r>
+      <w:r>
+        <w:t xml:space="preserve"> </w:t>
+      </w:r>
+      <w:r>
+        <w:rPr>
+          <w:rStyle w:val="VerbatimChar"/>
+        </w:rPr>
+        <w:t xml:space="preserve">trinity_nonce</w:t>
+      </w:r>
+      <w:r>
+        <w:t xml:space="preserve">, kill condition, hardware gate, scope/honesty caveats, purpose gate.</w:t>
       </w:r>
     </w:p>
     <w:p>
       <w:pPr>
         <w:numPr>
-          <w:ilvl w:val="1"/>
+          <w:ilvl w:val="0"/>
           <w:numId w:val="1002"/>
         </w:numPr>
         <w:pStyle w:val="Compact"/>
       </w:pPr>
       <w:r>
-        <w:rPr>
-          <w:bCs/>
-          <w:b/>
-        </w:rPr>
-        <w:t xml:space="preserve">HOLD</w:t>
-      </w:r>
-      <w:r>
-        <w:t xml:space="preserve"> </w:t>
-      </w:r>
-      <w:r>
-        <w:t xml:space="preserve">scenario → device 3 driven to S ≈ 2.08 (INCONCLUSIVE) → aggregate</w:t>
-      </w:r>
-      <w:r>
-        <w:t xml:space="preserve"> </w:t>
-      </w:r>
-      <w:r>
-        <w:rPr>
-          <w:bCs/>
-          <w:b/>
-        </w:rPr>
-        <w:t xml:space="preserve">HOLD</w:t>
-      </w:r>
-      <w:r>
-        <w:t xml:space="preserve">.</w:t>
+        <w:t xml:space="preserve">☒</w:t>
+      </w:r>
+      <w:r>
+        <w:t xml:space="preserve"> </w:t>
+      </w:r>
+      <w:r>
+        <w:rPr>
+          <w:bCs/>
+          <w:b/>
+        </w:rPr>
+        <w:t xml:space="preserve">Harness</w:t>
+      </w:r>
+      <w:r>
+        <w:t xml:space="preserve"> </w:t>
+      </w:r>
+      <w:r>
+        <w:t xml:space="preserve">(</w:t>
+      </w:r>
+      <w:r>
+        <w:rPr>
+          <w:rStyle w:val="VerbatimChar"/>
+        </w:rPr>
+        <w:t xml:space="preserve">trinity_harness.py</w:t>
+      </w:r>
+      <w:r>
+        <w:t xml:space="preserve">) — builds the CHSH witness, runs three independent</w:t>
+      </w:r>
+      <w:r>
+        <w:t xml:space="preserve"> </w:t>
+      </w:r>
+      <w:r>
+        <w:t xml:space="preserve">devices (simulator or hardware), assembles the</w:t>
+      </w:r>
+      <w:r>
+        <w:t xml:space="preserve"> </w:t>
+      </w:r>
+      <w:r>
+        <w:rPr>
+          <w:rStyle w:val="VerbatimChar"/>
+        </w:rPr>
+        <w:t xml:space="preserve">trinity-proofrecord-1.0</w:t>
+      </w:r>
+      <w:r>
+        <w:t xml:space="preserve"> </w:t>
+      </w:r>
+      <w:r>
+        <w:t xml:space="preserve">record, computes</w:t>
+      </w:r>
+      <w:r>
+        <w:t xml:space="preserve"> </w:t>
+      </w:r>
+      <w:r>
+        <w:t xml:space="preserve">the aggregate ExecutionProof verdict, writes report + JSON. Records the</w:t>
+      </w:r>
+      <w:r>
+        <w:t xml:space="preserve"> </w:t>
+      </w:r>
+      <w:r>
+        <w:rPr>
+          <w:bCs/>
+          <w:b/>
+        </w:rPr>
+        <w:t xml:space="preserve">actual physical</w:t>
+      </w:r>
+      <w:r>
+        <w:rPr>
+          <w:bCs/>
+          <w:b/>
+        </w:rPr>
+        <w:t xml:space="preserve"> </w:t>
+      </w:r>
+      <w:r>
+        <w:rPr>
+          <w:bCs/>
+          <w:b/>
+        </w:rPr>
+        <w:t xml:space="preserve">qubits</w:t>
+      </w:r>
+      <w:r>
+        <w:t xml:space="preserve"> </w:t>
+      </w:r>
+      <w:r>
+        <w:t xml:space="preserve">used after transpilation per circuit (post-layout).</w:t>
       </w:r>
     </w:p>
     <w:p>
       <w:pPr>
         <w:numPr>
-          <w:ilvl w:val="1"/>
+          <w:ilvl w:val="0"/>
           <w:numId w:val="1002"/>
         </w:numPr>
         <w:pStyle w:val="Compact"/>
       </w:pPr>
       <w:r>
-        <w:rPr>
-          <w:bCs/>
-          <w:b/>
-        </w:rPr>
-        <w:t xml:space="preserve">DENY</w:t>
-      </w:r>
-      <w:r>
-        <w:t xml:space="preserve"> </w:t>
-      </w:r>
-      <w:r>
-        <w:t xml:space="preserve">scenario → device 3 driven below classical (S ≈ 0.10, INVALID) → aggregate</w:t>
-      </w:r>
-      <w:r>
-        <w:t xml:space="preserve"> </w:t>
-      </w:r>
-      <w:r>
-        <w:rPr>
-          <w:bCs/>
-          <w:b/>
-        </w:rPr>
-        <w:t xml:space="preserve">DENY</w:t>
-      </w:r>
-      <w:r>
-        <w:t xml:space="preserve">.</w:t>
+        <w:t xml:space="preserve">☒</w:t>
+      </w:r>
+      <w:r>
+        <w:t xml:space="preserve"> </w:t>
+      </w:r>
+      <w:r>
+        <w:rPr>
+          <w:bCs/>
+          <w:b/>
+        </w:rPr>
+        <w:t xml:space="preserve">Independent verifier</w:t>
+      </w:r>
+      <w:r>
+        <w:t xml:space="preserve"> </w:t>
+      </w:r>
+      <w:r>
+        <w:t xml:space="preserve">(</w:t>
+      </w:r>
+      <w:r>
+        <w:rPr>
+          <w:rStyle w:val="VerbatimChar"/>
+        </w:rPr>
+        <w:t xml:space="preserve">trinity_verify.py</w:t>
+      </w:r>
+      <w:r>
+        <w:t xml:space="preserve">) — reconstructs every device S, verdict,</w:t>
+      </w:r>
+      <w:r>
+        <w:t xml:space="preserve"> </w:t>
+      </w:r>
+      <w:r>
+        <w:rPr>
+          <w:rStyle w:val="VerbatimChar"/>
+        </w:rPr>
+        <w:t xml:space="preserve">device_witness_hash</w:t>
+      </w:r>
+      <w:r>
+        <w:t xml:space="preserve">,</w:t>
+      </w:r>
+      <w:r>
+        <w:t xml:space="preserve"> </w:t>
+      </w:r>
+      <w:r>
+        <w:rPr>
+          <w:rStyle w:val="VerbatimChar"/>
+        </w:rPr>
+        <w:t xml:space="preserve">trinity_nonce</w:t>
+      </w:r>
+      <w:r>
+        <w:t xml:space="preserve">, and</w:t>
+      </w:r>
+      <w:r>
+        <w:t xml:space="preserve"> </w:t>
+      </w:r>
+      <w:r>
+        <w:rPr>
+          <w:rStyle w:val="VerbatimChar"/>
+        </w:rPr>
+        <w:t xml:space="preserve">record_hash</w:t>
+      </w:r>
+      <w:r>
+        <w:t xml:space="preserve"> </w:t>
+      </w:r>
+      <w:r>
+        <w:t xml:space="preserve">from raw counts, no qiskit.</w:t>
       </w:r>
     </w:p>
     <w:p>
       <w:pPr>
         <w:numPr>
-          <w:ilvl w:val="1"/>
+          <w:ilvl w:val="0"/>
           <w:numId w:val="1002"/>
         </w:numPr>
         <w:pStyle w:val="Compact"/>
       </w:pPr>
       <w:r>
-        <w:rPr>
-          <w:bCs/>
-          <w:b/>
-        </w:rPr>
-        <w:t xml:space="preserve">Tamper test</w:t>
-      </w:r>
-      <w:r>
-        <w:t xml:space="preserve"> </w:t>
-      </w:r>
-      <w:r>
-        <w:t xml:space="preserve">→ altering one raw count without recomputing the hash → verifier recomputes</w:t>
-      </w:r>
-      <w:r>
-        <w:t xml:space="preserve"> </w:t>
-      </w:r>
-      <w:r>
-        <w:rPr>
-          <w:bCs/>
-          <w:b/>
-        </w:rPr>
-        <w:t xml:space="preserve">DENY</w:t>
-      </w:r>
-      <w:r>
-        <w:t xml:space="preserve"> </w:t>
-      </w:r>
-      <w:r>
-        <w:t xml:space="preserve">and reports</w:t>
-      </w:r>
-      <w:r>
-        <w:t xml:space="preserve"> </w:t>
-      </w:r>
-      <w:r>
-        <w:rPr>
-          <w:bCs/>
-          <w:b/>
-        </w:rPr>
-        <w:t xml:space="preserve">FAIL</w:t>
-      </w:r>
-      <w:r>
-        <w:t xml:space="preserve"> </w:t>
-      </w:r>
-      <w:r>
-        <w:t xml:space="preserve">(record_hash mismatch caught).</w:t>
+        <w:t xml:space="preserve">☒</w:t>
+      </w:r>
+      <w:r>
+        <w:t xml:space="preserve"> </w:t>
+      </w:r>
+      <w:r>
+        <w:rPr>
+          <w:bCs/>
+          <w:b/>
+        </w:rPr>
+        <w:t xml:space="preserve">Preregistration + harness lock</w:t>
+      </w:r>
+      <w:r>
+        <w:t xml:space="preserve"> </w:t>
+      </w:r>
+      <w:r>
+        <w:t xml:space="preserve">(</w:t>
+      </w:r>
+      <w:r>
+        <w:rPr>
+          <w:rStyle w:val="VerbatimChar"/>
+        </w:rPr>
+        <w:t xml:space="preserve">MANIFEST.sha256</w:t>
+      </w:r>
+      <w:r>
+        <w:t xml:space="preserve">) — SHA-256, re-verified</w:t>
+      </w:r>
+      <w:r>
+        <w:t xml:space="preserve"> </w:t>
+      </w:r>
+      <w:r>
+        <w:rPr>
+          <w:rStyle w:val="VerbatimChar"/>
+        </w:rPr>
+        <w:t xml:space="preserve">OK</w:t>
+      </w:r>
+      <w:r>
+        <w:t xml:space="preserve">.</w:t>
       </w:r>
     </w:p>
     <w:p>
       <w:pPr>
         <w:numPr>
-          <w:ilvl w:val="1"/>
+          <w:ilvl w:val="0"/>
           <w:numId w:val="1002"/>
         </w:numPr>
         <w:pStyle w:val="Compact"/>
       </w:pPr>
       <w:r>
-        <w:rPr>
-          <w:bCs/>
-          <w:b/>
-        </w:rPr>
-        <w:t xml:space="preserve">Manifest-lock test</w:t>
-      </w:r>
-      <w:r>
-        <w:t xml:space="preserve"> </w:t>
-      </w:r>
-      <w:r>
-        <w:t xml:space="preserve">→ editing the harness after locking broke the declared hash →</w:t>
-      </w:r>
-      <w:r>
-        <w:t xml:space="preserve"> </w:t>
-      </w:r>
-      <w:r>
-        <w:t xml:space="preserve">provenance invalid →</w:t>
-      </w:r>
-      <w:r>
-        <w:t xml:space="preserve"> </w:t>
-      </w:r>
-      <w:r>
-        <w:rPr>
-          <w:bCs/>
-          <w:b/>
-        </w:rPr>
-        <w:t xml:space="preserve">DENY</w:t>
-      </w:r>
-      <w:r>
-        <w:t xml:space="preserve"> </w:t>
-      </w:r>
-      <w:r>
-        <w:t xml:space="preserve">(the lock works).</w:t>
-      </w:r>
-    </w:p>
-    <w:bookmarkEnd w:id="20"/>
-    <w:bookmarkStart w:id="21" w:name="gated-not-yet-done"/>
-    <w:p>
-      <w:pPr>
-        <w:pStyle w:val="Heading2"/>
-      </w:pPr>
-      <w:r>
-        <w:t xml:space="preserve">GATED — NOT yet done</w:t>
+        <w:t xml:space="preserve">☒</w:t>
+      </w:r>
+      <w:r>
+        <w:t xml:space="preserve"> </w:t>
+      </w:r>
+      <w:r>
+        <w:rPr>
+          <w:bCs/>
+          <w:b/>
+        </w:rPr>
+        <w:t xml:space="preserve">Simulator validation</w:t>
+      </w:r>
+      <w:r>
+        <w:t xml:space="preserve"> </w:t>
+      </w:r>
+      <w:r>
+        <w:t xml:space="preserve">— three independent noisy aer backends:</w:t>
       </w:r>
     </w:p>
     <w:p>
       <w:pPr>
         <w:numPr>
-          <w:ilvl w:val="0"/>
+          <w:ilvl w:val="1"/>
           <w:numId w:val="1003"/>
         </w:numPr>
         <w:pStyle w:val="Compact"/>
       </w:pPr>
       <w:r>
-        <w:t xml:space="preserve">☐</w:t>
-      </w:r>
-      <w:r>
-        <w:t xml:space="preserve"> </w:t>
-      </w:r>
-      <w:r>
-        <w:rPr>
-          <w:bCs/>
-          <w:b/>
-        </w:rPr>
-        <w:t xml:space="preserve">IBM Quantum hardware run on three devices.</w:t>
-      </w:r>
-      <w:r>
-        <w:t xml:space="preserve"> </w:t>
-      </w:r>
-      <w:r>
-        <w:t xml:space="preserve">Withheld per preregistration §8 until:</w:t>
+        <w:rPr>
+          <w:bCs/>
+          <w:b/>
+        </w:rPr>
+        <w:t xml:space="preserve">NOMINAL</w:t>
+      </w:r>
+      <w:r>
+        <w:t xml:space="preserve"> </w:t>
+      </w:r>
+      <w:r>
+        <w:t xml:space="preserve">→ all three VALID_ABOVE →</w:t>
+      </w:r>
+      <w:r>
+        <w:t xml:space="preserve"> </w:t>
+      </w:r>
+      <w:r>
+        <w:rPr>
+          <w:bCs/>
+          <w:b/>
+        </w:rPr>
+        <w:t xml:space="preserve">ALLOW</w:t>
+      </w:r>
+      <w:r>
+        <w:t xml:space="preserve">; verifier</w:t>
+      </w:r>
+      <w:r>
+        <w:t xml:space="preserve"> </w:t>
+      </w:r>
+      <w:r>
+        <w:rPr>
+          <w:bCs/>
+          <w:b/>
+        </w:rPr>
+        <w:t xml:space="preserve">PASS</w:t>
+      </w:r>
+      <w:r>
+        <w:t xml:space="preserve">.</w:t>
       </w:r>
     </w:p>
     <w:p>
       <w:pPr>
         <w:numPr>
           <w:ilvl w:val="1"/>
+          <w:numId w:val="1003"/>
+        </w:numPr>
+        <w:pStyle w:val="Compact"/>
+      </w:pPr>
+      <w:r>
+        <w:rPr>
+          <w:bCs/>
+          <w:b/>
+        </w:rPr>
+        <w:t xml:space="preserve">HOLD</w:t>
+      </w:r>
+      <w:r>
+        <w:t xml:space="preserve"> </w:t>
+      </w:r>
+      <w:r>
+        <w:t xml:space="preserve">scenario → device 3 driven to INCONCLUSIVE → aggregate</w:t>
+      </w:r>
+      <w:r>
+        <w:t xml:space="preserve"> </w:t>
+      </w:r>
+      <w:r>
+        <w:rPr>
+          <w:bCs/>
+          <w:b/>
+        </w:rPr>
+        <w:t xml:space="preserve">HOLD</w:t>
+      </w:r>
+      <w:r>
+        <w:t xml:space="preserve">.</w:t>
+      </w:r>
+    </w:p>
+    <w:p>
+      <w:pPr>
+        <w:numPr>
+          <w:ilvl w:val="1"/>
+          <w:numId w:val="1003"/>
+        </w:numPr>
+        <w:pStyle w:val="Compact"/>
+      </w:pPr>
+      <w:r>
+        <w:rPr>
+          <w:bCs/>
+          <w:b/>
+        </w:rPr>
+        <w:t xml:space="preserve">DENY</w:t>
+      </w:r>
+      <w:r>
+        <w:t xml:space="preserve"> </w:t>
+      </w:r>
+      <w:r>
+        <w:t xml:space="preserve">scenario → device 3 driven below classical (INVALID) → aggregate</w:t>
+      </w:r>
+      <w:r>
+        <w:t xml:space="preserve"> </w:t>
+      </w:r>
+      <w:r>
+        <w:rPr>
+          <w:bCs/>
+          <w:b/>
+        </w:rPr>
+        <w:t xml:space="preserve">DENY</w:t>
+      </w:r>
+      <w:r>
+        <w:t xml:space="preserve">.</w:t>
+      </w:r>
+    </w:p>
+    <w:p>
+      <w:pPr>
+        <w:numPr>
+          <w:ilvl w:val="1"/>
+          <w:numId w:val="1003"/>
+        </w:numPr>
+        <w:pStyle w:val="Compact"/>
+      </w:pPr>
+      <w:r>
+        <w:rPr>
+          <w:bCs/>
+          <w:b/>
+        </w:rPr>
+        <w:t xml:space="preserve">Tamper test</w:t>
+      </w:r>
+      <w:r>
+        <w:t xml:space="preserve"> </w:t>
+      </w:r>
+      <w:r>
+        <w:t xml:space="preserve">→ altering one raw count without recomputing the hash → verifier recomputes</w:t>
+      </w:r>
+      <w:r>
+        <w:t xml:space="preserve"> </w:t>
+      </w:r>
+      <w:r>
+        <w:rPr>
+          <w:bCs/>
+          <w:b/>
+        </w:rPr>
+        <w:t xml:space="preserve">DENY</w:t>
+      </w:r>
+      <w:r>
+        <w:t xml:space="preserve"> </w:t>
+      </w:r>
+      <w:r>
+        <w:t xml:space="preserve">and reports</w:t>
+      </w:r>
+      <w:r>
+        <w:t xml:space="preserve"> </w:t>
+      </w:r>
+      <w:r>
+        <w:rPr>
+          <w:bCs/>
+          <w:b/>
+        </w:rPr>
+        <w:t xml:space="preserve">FAIL</w:t>
+      </w:r>
+      <w:r>
+        <w:t xml:space="preserve"> </w:t>
+      </w:r>
+      <w:r>
+        <w:t xml:space="preserve">(record_hash mismatch caught).</w:t>
+      </w:r>
+    </w:p>
+    <w:p>
+      <w:pPr>
+        <w:numPr>
+          <w:ilvl w:val="1"/>
+          <w:numId w:val="1003"/>
+        </w:numPr>
+        <w:pStyle w:val="Compact"/>
+      </w:pPr>
+      <w:r>
+        <w:rPr>
+          <w:bCs/>
+          <w:b/>
+        </w:rPr>
+        <w:t xml:space="preserve">Manifest-lock test</w:t>
+      </w:r>
+      <w:r>
+        <w:t xml:space="preserve"> </w:t>
+      </w:r>
+      <w:r>
+        <w:t xml:space="preserve">→ editing the harness after locking broke the declared hash →</w:t>
+      </w:r>
+      <w:r>
+        <w:t xml:space="preserve"> </w:t>
+      </w:r>
+      <w:r>
+        <w:t xml:space="preserve">provenance invalid →</w:t>
+      </w:r>
+      <w:r>
+        <w:t xml:space="preserve"> </w:t>
+      </w:r>
+      <w:r>
+        <w:rPr>
+          <w:bCs/>
+          <w:b/>
+        </w:rPr>
+        <w:t xml:space="preserve">DENY</w:t>
+      </w:r>
+      <w:r>
+        <w:t xml:space="preserve"> </w:t>
+      </w:r>
+      <w:r>
+        <w:t xml:space="preserve">(the lock works).</w:t>
+      </w:r>
+    </w:p>
+    <w:p>
+      <w:pPr>
+        <w:numPr>
+          <w:ilvl w:val="0"/>
+          <w:numId w:val="1002"/>
+        </w:numPr>
+        <w:pStyle w:val="Compact"/>
+      </w:pPr>
+      <w:r>
+        <w:t xml:space="preserve">☒</w:t>
+      </w:r>
+      <w:r>
+        <w:t xml:space="preserve"> </w:t>
+      </w:r>
+      <w:r>
+        <w:rPr>
+          <w:bCs/>
+          <w:b/>
+        </w:rPr>
+        <w:t xml:space="preserve">Hardware run</w:t>
+      </w:r>
+      <w:r>
+        <w:t xml:space="preserve"> </w:t>
+      </w:r>
+      <w:r>
+        <w:t xml:space="preserve">on</w:t>
+      </w:r>
+      <w:r>
+        <w:t xml:space="preserve"> </w:t>
+      </w:r>
+      <w:r>
+        <w:rPr>
+          <w:rStyle w:val="VerbatimChar"/>
+        </w:rPr>
+        <w:t xml:space="preserve">ibm_kingston</w:t>
+      </w:r>
+      <w:r>
+        <w:t xml:space="preserve"> </w:t>
+      </w:r>
+      <w:r>
+        <w:t xml:space="preserve">+</w:t>
+      </w:r>
+      <w:r>
+        <w:t xml:space="preserve"> </w:t>
+      </w:r>
+      <w:r>
+        <w:rPr>
+          <w:rStyle w:val="VerbatimChar"/>
+        </w:rPr>
+        <w:t xml:space="preserve">ibm_fez</w:t>
+      </w:r>
+      <w:r>
+        <w:t xml:space="preserve"> </w:t>
+      </w:r>
+      <w:r>
+        <w:t xml:space="preserve">+</w:t>
+      </w:r>
+      <w:r>
+        <w:t xml:space="preserve"> </w:t>
+      </w:r>
+      <w:r>
+        <w:rPr>
+          <w:rStyle w:val="VerbatimChar"/>
+        </w:rPr>
+        <w:t xml:space="preserve">ibm_marrakesh</w:t>
+      </w:r>
+      <w:r>
+        <w:t xml:space="preserve"> </w:t>
+      </w:r>
+      <w:r>
+        <w:t xml:space="preserve">— genuine CHSH</w:t>
+      </w:r>
+      <w:r>
+        <w:t xml:space="preserve"> </w:t>
+      </w:r>
+      <w:r>
+        <w:t xml:space="preserve">violation on all three, aggregate</w:t>
+      </w:r>
+      <w:r>
+        <w:t xml:space="preserve"> </w:t>
+      </w:r>
+      <w:r>
+        <w:rPr>
+          <w:bCs/>
+          <w:b/>
+        </w:rPr>
+        <w:t xml:space="preserve">ALLOW</w:t>
+      </w:r>
+      <w:r>
+        <w:t xml:space="preserve">, verifier</w:t>
+      </w:r>
+      <w:r>
+        <w:t xml:space="preserve"> </w:t>
+      </w:r>
+      <w:r>
+        <w:rPr>
+          <w:bCs/>
+          <w:b/>
+        </w:rPr>
+        <w:t xml:space="preserve">PASS</w:t>
+      </w:r>
+      <w:r>
+        <w:t xml:space="preserve">.</w:t>
+      </w:r>
+    </w:p>
+    <w:bookmarkEnd w:id="21"/>
+    <w:bookmarkStart w:id="22" w:name="X849d654b6e0fd125ad29eab55db743b57cdf866"/>
+    <w:p>
+      <w:pPr>
+        <w:pStyle w:val="Heading2"/>
+      </w:pPr>
+      <w:r>
+        <w:t xml:space="preserve">Scope &amp; honesty (unchanged from preregistration)</w:t>
+      </w:r>
+    </w:p>
+    <w:p>
+      <w:pPr>
+        <w:numPr>
+          <w:ilvl w:val="0"/>
           <w:numId w:val="1004"/>
         </w:numPr>
         <w:pStyle w:val="Compact"/>
       </w:pPr>
       <w:r>
-        <w:rPr>
-          <w:bCs/>
-          <w:b/>
-        </w:rPr>
-        <w:t xml:space="preserve">(a)</w:t>
-      </w:r>
-      <w:r>
-        <w:t xml:space="preserve"> </w:t>
-      </w:r>
-      <w:r>
-        <w:t xml:space="preserve">the exposed IBM Quantum token is</w:t>
-      </w:r>
-      <w:r>
-        <w:t xml:space="preserve"> </w:t>
-      </w:r>
-      <w:r>
-        <w:rPr>
-          <w:bCs/>
-          <w:b/>
-        </w:rPr>
-        <w:t xml:space="preserve">rotated</w:t>
-      </w:r>
-      <w:r>
-        <w:t xml:space="preserve"> </w:t>
-      </w:r>
-      <w:r>
-        <w:t xml:space="preserve">— any token seen in a chat transcript</w:t>
-      </w:r>
-      <w:r>
-        <w:t xml:space="preserve"> </w:t>
-      </w:r>
-      <w:r>
-        <w:t xml:space="preserve">or screenshot is considered compromised, and</w:t>
-      </w:r>
-    </w:p>
-    <w:p>
-      <w:pPr>
-        <w:numPr>
-          <w:ilvl w:val="1"/>
-          <w:numId w:val="1004"/>
-        </w:numPr>
-        <w:pStyle w:val="Compact"/>
-      </w:pPr>
-      <w:r>
-        <w:rPr>
-          <w:bCs/>
-          <w:b/>
-        </w:rPr>
-        <w:t xml:space="preserve">(b)</w:t>
-      </w:r>
-      <w:r>
-        <w:t xml:space="preserve"> </w:t>
-      </w:r>
-      <w:r>
-        <w:t xml:space="preserve">Derek</w:t>
-      </w:r>
-      <w:r>
-        <w:t xml:space="preserve"> </w:t>
-      </w:r>
-      <w:r>
-        <w:rPr>
-          <w:bCs/>
-          <w:b/>
-        </w:rPr>
-        <w:t xml:space="preserve">explicitly authorizes</w:t>
-      </w:r>
-      <w:r>
-        <w:t xml:space="preserve"> </w:t>
-      </w:r>
-      <w:r>
-        <w:t xml:space="preserve">the hardware run.</w:t>
-      </w:r>
-    </w:p>
-    <w:bookmarkEnd w:id="21"/>
-    <w:bookmarkStart w:id="22" w:name="X5f9dd7e12e4184409ffe0d14c7d097ca8902dd9"/>
+        <w:t xml:space="preserve">This is a</w:t>
+      </w:r>
+      <w:r>
+        <w:t xml:space="preserve"> </w:t>
+      </w:r>
+      <w:r>
+        <w:rPr>
+          <w:bCs/>
+          <w:b/>
+        </w:rPr>
+        <w:t xml:space="preserve">device-dependent</w:t>
+      </w:r>
+      <w:r>
+        <w:t xml:space="preserve"> </w:t>
+      </w:r>
+      <w:r>
+        <w:t xml:space="preserve">demonstration of nonclassicality reproduced across three</w:t>
+      </w:r>
+      <w:r>
+        <w:t xml:space="preserve"> </w:t>
+      </w:r>
+      <w:r>
+        <w:t xml:space="preserve">processors and cryptographically fused into one governance record. It is</w:t>
+      </w:r>
+      <w:r>
+        <w:t xml:space="preserve"> </w:t>
+      </w:r>
+      <w:r>
+        <w:rPr>
+          <w:bCs/>
+          <w:b/>
+        </w:rPr>
+        <w:t xml:space="preserve">not</w:t>
+      </w:r>
+      <w:r>
+        <w:t xml:space="preserve"> </w:t>
+      </w:r>
+      <w:r>
+        <w:t xml:space="preserve">device-independent, does</w:t>
+      </w:r>
+      <w:r>
+        <w:t xml:space="preserve"> </w:t>
+      </w:r>
+      <w:r>
+        <w:rPr>
+          <w:bCs/>
+          <w:b/>
+        </w:rPr>
+        <w:t xml:space="preserve">not</w:t>
+      </w:r>
+      <w:r>
+        <w:t xml:space="preserve"> </w:t>
+      </w:r>
+      <w:r>
+        <w:t xml:space="preserve">close the detection or locality loopholes, and does</w:t>
+      </w:r>
+      <w:r>
+        <w:t xml:space="preserve"> </w:t>
+      </w:r>
+      <w:r>
+        <w:rPr>
+          <w:bCs/>
+          <w:b/>
+        </w:rPr>
+        <w:t xml:space="preserve">not</w:t>
+      </w:r>
+      <w:r>
+        <w:t xml:space="preserve"> </w:t>
+      </w:r>
+      <w:r>
+        <w:t xml:space="preserve">entangle the three processors with one another. Each device is a separate, self-contained</w:t>
+      </w:r>
+      <w:r>
+        <w:t xml:space="preserve"> </w:t>
+      </w:r>
+      <w:r>
+        <w:t xml:space="preserve">CHSH experiment; TRINITY is the reproduction + fusion claim, nothing more.</w:t>
+      </w:r>
+    </w:p>
+    <w:bookmarkEnd w:id="22"/>
+    <w:bookmarkStart w:id="23" w:name="provenance-reproducibility"/>
     <w:p>
       <w:pPr>
         <w:pStyle w:val="Heading2"/>
       </w:pPr>
       <w:r>
-        <w:t xml:space="preserve">How to run the hardware step (after the gate conditions are met)</w:t>
+        <w:t xml:space="preserve">Provenance / reproducibility</w:t>
       </w:r>
     </w:p>
     <w:p>
@@ -717,252 +1397,107 @@
         <w:rPr>
           <w:rStyle w:val="NormalTok"/>
         </w:rPr>
-        <w:t xml:space="preserve"> </w:t>
-      </w:r>
-      <w:r>
-        <w:rPr>
-          <w:rStyle w:val="OperatorTok"/>
-        </w:rPr>
-        <w:t xml:space="preserve">&lt;(</w:t>
-      </w:r>
-      <w:r>
-        <w:rPr>
-          <w:rStyle w:val="FunctionTok"/>
-        </w:rPr>
-        <w:t xml:space="preserve">awk</w:t>
+        <w:t xml:space="preserve"> MANIFEST.sha256          </w:t>
+      </w:r>
+      <w:r>
+        <w:rPr>
+          <w:rStyle w:val="CommentTok"/>
+        </w:rPr>
+        <w:t xml:space="preserve"># confirm prereg + harness lock intact</w:t>
+      </w:r>
+      <w:r>
+        <w:br/>
+      </w:r>
+      <w:r>
+        <w:rPr>
+          <w:rStyle w:val="ExtensionTok"/>
+        </w:rPr>
+        <w:t xml:space="preserve">python3</w:t>
       </w:r>
       <w:r>
         <w:rPr>
           <w:rStyle w:val="NormalTok"/>
         </w:rPr>
-        <w:t xml:space="preserve"> </w:t>
-      </w:r>
-      <w:r>
-        <w:rPr>
-          <w:rStyle w:val="StringTok"/>
-        </w:rPr>
-        <w:t xml:space="preserve">'NF==2{print $1"  "$2}'</w:t>
-      </w:r>
-      <w:r>
-        <w:rPr>
-          <w:rStyle w:val="NormalTok"/>
-        </w:rPr>
-        <w:t xml:space="preserve"> MANIFEST.sha256</w:t>
-      </w:r>
-      <w:r>
-        <w:rPr>
-          <w:rStyle w:val="OperatorTok"/>
-        </w:rPr>
-        <w:t xml:space="preserve">)</w:t>
-      </w:r>
-      <w:r>
-        <w:rPr>
-          <w:rStyle w:val="NormalTok"/>
-        </w:rPr>
-        <w:t xml:space="preserve">   </w:t>
+        <w:t xml:space="preserve"> trinity_verify.py             </w:t>
       </w:r>
       <w:r>
         <w:rPr>
           <w:rStyle w:val="CommentTok"/>
         </w:rPr>
-        <w:t xml:space="preserve"># confirm lock intact</w:t>
-      </w:r>
-      <w:r>
-        <w:br/>
-      </w:r>
-      <w:r>
-        <w:rPr>
-          <w:rStyle w:val="BuiltInTok"/>
-        </w:rPr>
-        <w:t xml:space="preserve">export</w:t>
-      </w:r>
-      <w:r>
-        <w:rPr>
-          <w:rStyle w:val="NormalTok"/>
-        </w:rPr>
-        <w:t xml:space="preserve"> </w:t>
-      </w:r>
-      <w:r>
-        <w:rPr>
-          <w:rStyle w:val="VariableTok"/>
+        <w:t xml:space="preserve"># independent reconstruction from raw counts → PASS</w:t>
+      </w:r>
+    </w:p>
+    <w:bookmarkEnd w:id="23"/>
+    <w:bookmarkStart w:id="24" w:name="security-note"/>
+    <w:p>
+      <w:pPr>
+        <w:pStyle w:val="Heading2"/>
+      </w:pPr>
+      <w:r>
+        <w:t xml:space="preserve">Security note</w:t>
+      </w:r>
+    </w:p>
+    <w:p>
+      <w:pPr>
+        <w:pStyle w:val="FirstParagraph"/>
+      </w:pPr>
+      <w:r>
+        <w:t xml:space="preserve">The IBM Quantum token used for this run was pasted in chat and is therefore considered</w:t>
+      </w:r>
+      <w:r>
+        <w:t xml:space="preserve"> </w:t>
+      </w:r>
+      <w:r>
+        <w:rPr>
+          <w:bCs/>
+          <w:b/>
+        </w:rPr>
+        <w:t xml:space="preserve">compromised</w:t>
+      </w:r>
+      <w:r>
+        <w:t xml:space="preserve"> </w:t>
+      </w:r>
+      <w:r>
+        <w:t xml:space="preserve">— rotate it at https://quantum.cloud.ibm.com. The harness only reads the token</w:t>
+      </w:r>
+      <w:r>
+        <w:t xml:space="preserve"> </w:t>
+      </w:r>
+      <w:r>
+        <w:t xml:space="preserve">from the</w:t>
+      </w:r>
+      <w:r>
+        <w:t xml:space="preserve"> </w:t>
+      </w:r>
+      <w:r>
+        <w:rPr>
+          <w:rStyle w:val="VerbatimChar"/>
         </w:rPr>
         <w:t xml:space="preserve">IBM_QUANTUM_TOKEN</w:t>
       </w:r>
       <w:r>
-        <w:rPr>
-          <w:rStyle w:val="OperatorTok"/>
-        </w:rPr>
-        <w:t xml:space="preserve">=</w:t>
-      </w:r>
-      <w:r>
-        <w:rPr>
-          <w:rStyle w:val="StringTok"/>
-        </w:rPr>
-        <w:t xml:space="preserve">"your-rotated-token"</w:t>
-      </w:r>
-      <w:r>
-        <w:rPr>
-          <w:rStyle w:val="NormalTok"/>
-        </w:rPr>
-        <w:t xml:space="preserve">                  </w:t>
-      </w:r>
-      <w:r>
-        <w:rPr>
-          <w:rStyle w:val="CommentTok"/>
-        </w:rPr>
-        <w:t xml:space="preserve"># never commit / never paste in chat</w:t>
-      </w:r>
-      <w:r>
-        <w:br/>
-      </w:r>
-      <w:r>
-        <w:rPr>
-          <w:rStyle w:val="ExtensionTok"/>
-        </w:rPr>
-        <w:t xml:space="preserve">python3</w:t>
-      </w:r>
-      <w:r>
-        <w:rPr>
-          <w:rStyle w:val="NormalTok"/>
-        </w:rPr>
-        <w:t xml:space="preserve"> trinity_harness.py </w:t>
-      </w:r>
-      <w:r>
-        <w:rPr>
-          <w:rStyle w:val="AttributeTok"/>
-        </w:rPr>
-        <w:t xml:space="preserve">--authorize-hardware</w:t>
-      </w:r>
-      <w:r>
-        <w:rPr>
-          <w:rStyle w:val="NormalTok"/>
-        </w:rPr>
-        <w:t xml:space="preserve"> </w:t>
-      </w:r>
-      <w:r>
-        <w:rPr>
-          <w:rStyle w:val="AttributeTok"/>
-        </w:rPr>
-        <w:t xml:space="preserve">--allow-unrotated</w:t>
-      </w:r>
-      <w:r>
-        <w:br/>
-      </w:r>
-      <w:r>
-        <w:rPr>
-          <w:rStyle w:val="ExtensionTok"/>
-        </w:rPr>
-        <w:t xml:space="preserve">python3</w:t>
-      </w:r>
-      <w:r>
-        <w:rPr>
-          <w:rStyle w:val="NormalTok"/>
-        </w:rPr>
-        <w:t xml:space="preserve"> trinity_verify.py</w:t>
-      </w:r>
-    </w:p>
-    <w:bookmarkEnd w:id="22"/>
-    <w:bookmarkStart w:id="23" w:name="security-note"/>
-    <w:p>
-      <w:pPr>
-        <w:pStyle w:val="Heading2"/>
-      </w:pPr>
-      <w:r>
-        <w:t xml:space="preserve">Security note</w:t>
-      </w:r>
-    </w:p>
-    <w:p>
-      <w:pPr>
-        <w:pStyle w:val="FirstParagraph"/>
-      </w:pPr>
-      <w:r>
-        <w:t xml:space="preserve">Treat the IBM Quantum token visible in the recent screenshot / any pasted string as</w:t>
-      </w:r>
-      <w:r>
-        <w:t xml:space="preserve"> </w:t>
-      </w:r>
-      <w:r>
-        <w:rPr>
-          <w:bCs/>
-          <w:b/>
-        </w:rPr>
-        <w:t xml:space="preserve">compromised</w:t>
-      </w:r>
-      <w:r>
-        <w:t xml:space="preserve">. Rotate it at https://quantum.cloud.ibm.com before the hardware run. The</w:t>
-      </w:r>
-      <w:r>
-        <w:t xml:space="preserve"> </w:t>
-      </w:r>
-      <w:r>
-        <w:t xml:space="preserve">harness only reads the token from the</w:t>
-      </w:r>
-      <w:r>
-        <w:t xml:space="preserve"> </w:t>
+        <w:t xml:space="preserve"> </w:t>
+      </w:r>
+      <w:r>
+        <w:t xml:space="preserve">environment variable — never hard-coded, never committed</w:t>
+      </w:r>
+      <w:r>
+        <w:t xml:space="preserve"> </w:t>
+      </w:r>
+      <w:r>
+        <w:t xml:space="preserve">(</w:t>
       </w:r>
       <w:r>
         <w:rPr>
           <w:rStyle w:val="VerbatimChar"/>
         </w:rPr>
-        <w:t xml:space="preserve">IBM_QUANTUM_TOKEN</w:t>
-      </w:r>
-      <w:r>
-        <w:t xml:space="preserve"> </w:t>
-      </w:r>
-      <w:r>
-        <w:t xml:space="preserve">environment variable — it is never</w:t>
-      </w:r>
-      <w:r>
-        <w:t xml:space="preserve"> </w:t>
-      </w:r>
-      <w:r>
-        <w:t xml:space="preserve">hard-coded and never committed.</w:t>
-      </w:r>
-    </w:p>
-    <w:bookmarkEnd w:id="23"/>
-    <w:bookmarkStart w:id="24" w:name="next-decision-point"/>
-    <w:p>
-      <w:pPr>
-        <w:pStyle w:val="Heading2"/>
-      </w:pPr>
-      <w:r>
-        <w:t xml:space="preserve">Next decision point</w:t>
-      </w:r>
-    </w:p>
-    <w:p>
-      <w:pPr>
-        <w:pStyle w:val="FirstParagraph"/>
-      </w:pPr>
-      <w:r>
-        <w:rPr>
-          <w:bCs/>
-          <w:b/>
-        </w:rPr>
-        <w:t xml:space="preserve">Derek:</w:t>
-      </w:r>
-      <w:r>
-        <w:t xml:space="preserve"> </w:t>
-      </w:r>
-      <w:r>
-        <w:t xml:space="preserve">confirm</w:t>
-      </w:r>
-      <w:r>
-        <w:t xml:space="preserve"> </w:t>
-      </w:r>
-      <w:r>
-        <w:t xml:space="preserve">“</w:t>
-      </w:r>
-      <w:r>
-        <w:t xml:space="preserve">authorize hardware, token rotated/set</w:t>
-      </w:r>
-      <w:r>
-        <w:t xml:space="preserve">”</w:t>
-      </w:r>
-      <w:r>
-        <w:t xml:space="preserve"> </w:t>
-      </w:r>
-      <w:r>
-        <w:t xml:space="preserve">and I will execute TRINITY-1 across</w:t>
+        <w:t xml:space="preserve">.gitignore</w:t>
+      </w:r>
+      <w:r>
+        <w:t xml:space="preserve"> </w:t>
+      </w:r>
+      <w:r>
+        <w:t xml:space="preserve">excludes</w:t>
       </w:r>
       <w:r>
         <w:t xml:space="preserve"> </w:t>
@@ -971,46 +1506,10 @@
         <w:rPr>
           <w:rStyle w:val="VerbatimChar"/>
         </w:rPr>
-        <w:t xml:space="preserve">ibm_kingston</w:t>
-      </w:r>
-      <w:r>
-        <w:t xml:space="preserve"> </w:t>
-      </w:r>
-      <w:r>
-        <w:t xml:space="preserve">+</w:t>
-      </w:r>
-      <w:r>
-        <w:t xml:space="preserve"> </w:t>
-      </w:r>
-      <w:r>
-        <w:rPr>
-          <w:rStyle w:val="VerbatimChar"/>
-        </w:rPr>
-        <w:t xml:space="preserve">ibm_fez</w:t>
-      </w:r>
-      <w:r>
-        <w:t xml:space="preserve"> </w:t>
-      </w:r>
-      <w:r>
-        <w:t xml:space="preserve">+</w:t>
-      </w:r>
-      <w:r>
-        <w:t xml:space="preserve"> </w:t>
-      </w:r>
-      <w:r>
-        <w:rPr>
-          <w:rStyle w:val="VerbatimChar"/>
-        </w:rPr>
-        <w:t xml:space="preserve">ibm_marrakesh</w:t>
-      </w:r>
-      <w:r>
-        <w:t xml:space="preserve">, verify, and (on your go) commit to GitHub and</w:t>
-      </w:r>
-      <w:r>
-        <w:t xml:space="preserve"> </w:t>
-      </w:r>
-      <w:r>
-        <w:t xml:space="preserve">publish to Zenodo with a version DOI — whatever the verdict.</w:t>
+        <w:t xml:space="preserve">.env</w:t>
+      </w:r>
+      <w:r>
+        <w:t xml:space="preserve">).</w:t>
       </w:r>
     </w:p>
     <w:bookmarkEnd w:id="24"/>
@@ -1191,91 +1690,6 @@
     <w:lvl w:ilvl="8">
       <w:numFmt w:val="bullet"/>
       <w:lvlText w:val="•"/>
-      <w:lvlJc w:val="left"/>
-      <w:pPr>
-        <w:ind w:left="6480" w:hanging="480"/>
-      </w:pPr>
-    </w:lvl>
-  </w:abstractNum>
-  <w:abstractNum w:abstractNumId="99411">
-    <w:nsid w:val="A99411"/>
-    <w:multiLevelType w:val="multilevel"/>
-    <w:lvl w:ilvl="0">
-      <w:start w:val="1"/>
-      <w:numFmt w:val="decimal"/>
-      <w:lvlText w:val="%1."/>
-      <w:lvlJc w:val="left"/>
-      <w:pPr>
-        <w:ind w:left="720" w:hanging="480"/>
-      </w:pPr>
-    </w:lvl>
-    <w:lvl w:ilvl="1">
-      <w:start w:val="1"/>
-      <w:numFmt w:val="decimal"/>
-      <w:lvlText w:val="%2."/>
-      <w:lvlJc w:val="left"/>
-      <w:pPr>
-        <w:ind w:left="1440" w:hanging="480"/>
-      </w:pPr>
-    </w:lvl>
-    <w:lvl w:ilvl="2">
-      <w:start w:val="1"/>
-      <w:numFmt w:val="decimal"/>
-      <w:lvlText w:val="%3."/>
-      <w:lvlJc w:val="left"/>
-      <w:pPr>
-        <w:ind w:left="2160" w:hanging="480"/>
-      </w:pPr>
-    </w:lvl>
-    <w:lvl w:ilvl="3">
-      <w:start w:val="1"/>
-      <w:numFmt w:val="decimal"/>
-      <w:lvlText w:val="%4."/>
-      <w:lvlJc w:val="left"/>
-      <w:pPr>
-        <w:ind w:left="2880" w:hanging="480"/>
-      </w:pPr>
-    </w:lvl>
-    <w:lvl w:ilvl="4">
-      <w:start w:val="1"/>
-      <w:numFmt w:val="decimal"/>
-      <w:lvlText w:val="%5."/>
-      <w:lvlJc w:val="left"/>
-      <w:pPr>
-        <w:ind w:left="3600" w:hanging="480"/>
-      </w:pPr>
-    </w:lvl>
-    <w:lvl w:ilvl="5">
-      <w:start w:val="1"/>
-      <w:numFmt w:val="decimal"/>
-      <w:lvlText w:val="%6."/>
-      <w:lvlJc w:val="left"/>
-      <w:pPr>
-        <w:ind w:left="4320" w:hanging="480"/>
-      </w:pPr>
-    </w:lvl>
-    <w:lvl w:ilvl="6">
-      <w:start w:val="1"/>
-      <w:numFmt w:val="decimal"/>
-      <w:lvlText w:val="%7."/>
-      <w:lvlJc w:val="left"/>
-      <w:pPr>
-        <w:ind w:left="5040" w:hanging="480"/>
-      </w:pPr>
-    </w:lvl>
-    <w:lvl w:ilvl="7">
-      <w:start w:val="1"/>
-      <w:numFmt w:val="decimal"/>
-      <w:lvlText w:val="%8."/>
-      <w:lvlJc w:val="left"/>
-      <w:pPr>
-        <w:ind w:left="5760" w:hanging="480"/>
-      </w:pPr>
-    </w:lvl>
-    <w:lvl w:ilvl="8">
-      <w:start w:val="1"/>
-      <w:numFmt w:val="decimal"/>
-      <w:lvlText w:val="%9."/>
       <w:lvlJc w:val="left"/>
       <w:pPr>
         <w:ind w:left="6480" w:hanging="480"/>
@@ -1295,34 +1709,7 @@
     <w:abstractNumId w:val="991"/>
   </w:num>
   <w:num w:numId="1004">
-    <w:abstractNumId w:val="99411"/>
-    <w:lvlOverride w:ilvl="0">
-      <w:startOverride w:val="1"/>
-    </w:lvlOverride>
-    <w:lvlOverride w:ilvl="1">
-      <w:startOverride w:val="1"/>
-    </w:lvlOverride>
-    <w:lvlOverride w:ilvl="2">
-      <w:startOverride w:val="1"/>
-    </w:lvlOverride>
-    <w:lvlOverride w:ilvl="3">
-      <w:startOverride w:val="1"/>
-    </w:lvlOverride>
-    <w:lvlOverride w:ilvl="4">
-      <w:startOverride w:val="1"/>
-    </w:lvlOverride>
-    <w:lvlOverride w:ilvl="5">
-      <w:startOverride w:val="1"/>
-    </w:lvlOverride>
-    <w:lvlOverride w:ilvl="6">
-      <w:startOverride w:val="1"/>
-    </w:lvlOverride>
-    <w:lvlOverride w:ilvl="7">
-      <w:startOverride w:val="1"/>
-    </w:lvlOverride>
-    <w:lvlOverride w:ilvl="8">
-      <w:startOverride w:val="1"/>
-    </w:lvlOverride>
+    <w:abstractNumId w:val="991"/>
   </w:num>
 </w:numbering>
 </file>

</xml_diff>

<commit_message>
TRINITY-1 clarifications: address 7-point design review at documentation layer
- Fix STATUS shot-count typo (4,000/circuit x4 x3 = 48,000; record was always consistent)
- README: 'first'->'unusual', 'authorization record'->'governed evidence record', common-provider note
- Add TRINITY-1-CLARIFICATIONS.md: triage all 7 review points, preserve sealed prereg/harness
- Disclose calibration_hash binds only last-cal timestamp (->calibration_timestamp_hash); fuller snapshot = TRINITY-2
- Add descriptive cross-device spread (S_min/max/mean/range/std); no measured value changed
</commit_message>
<xml_diff>
--- a/STATUS.docx
+++ b/STATUS.docx
@@ -568,7 +568,7 @@
         <w:pStyle w:val="Compact"/>
       </w:pPr>
       <w:r>
-        <w:t xml:space="preserve">Shots: 12,000 per circuit × 4 circuits × 3 devices =</w:t>
+        <w:t xml:space="preserve">Shots: 4,000 per circuit × 4 circuits × 3 devices =</w:t>
       </w:r>
       <w:r>
         <w:t xml:space="preserve"> </w:t>
@@ -584,7 +584,28 @@
         <w:t xml:space="preserve"> </w:t>
       </w:r>
       <w:r>
-        <w:t xml:space="preserve">total.</w:t>
+        <w:t xml:space="preserve">total (matches prereg + locked</w:t>
+      </w:r>
+      <w:r>
+        <w:t xml:space="preserve"> </w:t>
+      </w:r>
+      <w:r>
+        <w:t xml:space="preserve">harness</w:t>
+      </w:r>
+      <w:r>
+        <w:t xml:space="preserve"> </w:t>
+      </w:r>
+      <w:r>
+        <w:rPr>
+          <w:rStyle w:val="VerbatimChar"/>
+        </w:rPr>
+        <w:t xml:space="preserve">--shots</w:t>
+      </w:r>
+      <w:r>
+        <w:t xml:space="preserve"> </w:t>
+      </w:r>
+      <w:r>
+        <w:t xml:space="preserve">default; OMNI shot-count-consistency lesson honored).</w:t>
       </w:r>
     </w:p>
     <w:p>

</xml_diff>

<commit_message>
TRINITY-2 HARDWARE COMPLETE: executed on ibm_kingston/fez/marrakesh, verdict ALLOW, independently verified
- Three live IBM Heron r2 processors, Bell-CHSH witness, 48,000 shots total
- D1 kingston S=2.7650, D2 fez S=2.7235, D3 marrakesh S=2.7235 (all PASS)
- Quorum 3/3, aggregate ALLOW -> governed action AUTHORIZED, trinity_certified=True
- record_hash 4f6fa000...  fused_nonce aa527fe2...  chain-linked to TRINITY-1
- Independent verifier PASS (no qiskit); manifest lock verified intact pre-run
- Jobs: kingston d9e7029htsac739dt2mg, fez d9e71lqneu4c739o3otg, marrakesh d9e71pcjeosc73fie1r0
</commit_message>
<xml_diff>
--- a/STATUS.docx
+++ b/STATUS.docx
@@ -2,13 +2,13 @@
 <file path=word/document.xml><?xml version="1.0" encoding="utf-8"?>
 <w:document xmlns:w="http://schemas.openxmlformats.org/wordprocessingml/2006/main" xmlns:m="http://schemas.openxmlformats.org/officeDocument/2006/math" xmlns:r="http://schemas.openxmlformats.org/officeDocument/2006/relationships" xmlns:o="urn:schemas-microsoft-com:office:office" xmlns:v="urn:schemas-microsoft-com:vml" xmlns:w10="urn:schemas-microsoft-com:office:word" xmlns:a="http://schemas.openxmlformats.org/drawingml/2006/main" xmlns:pic="http://schemas.openxmlformats.org/drawingml/2006/picture" xmlns:wp="http://schemas.openxmlformats.org/drawingml/2006/wordprocessingDrawing">
   <w:body>
-    <w:bookmarkStart w:id="25" w:name="trinity-1-status"/>
+    <w:bookmarkStart w:id="29" w:name="trinity-status"/>
     <w:p>
       <w:pPr>
         <w:pStyle w:val="Heading1"/>
       </w:pPr>
       <w:r>
-        <w:t xml:space="preserve">TRINITY-1 — STATUS</w:t>
+        <w:t xml:space="preserve">TRINITY — STATUS</w:t>
       </w:r>
     </w:p>
     <w:p>
@@ -22,9 +22,1567 @@
         </w:rPr>
         <w:t xml:space="preserve">Remnant Fieldworks Inc. · Coherent Inheritance Framework (CIF) · ExecutionProof-governed</w:t>
       </w:r>
-      <w:r>
-        <w:t xml:space="preserve"> </w:t>
-      </w:r>
+    </w:p>
+    <w:p>
+      <w:r>
+        <w:pict>
+          <v:rect style="width:0;height:1.5pt" o:hralign="center" o:hrstd="t" o:hr="t"/>
+        </w:pict>
+      </w:r>
+    </w:p>
+    <w:bookmarkStart w:id="22" w:name="Xd2d148c84ce4b4a3a17aead9963a9ed3b8f3e36"/>
+    <w:p>
+      <w:pPr>
+        <w:pStyle w:val="Heading2"/>
+      </w:pPr>
+      <w:r>
+        <w:t xml:space="preserve">TRINITY-2 — The Governed Action — HARDWARE COMPLETE, INDEPENDENTLY VERIFIED</w:t>
+      </w:r>
+    </w:p>
+    <w:p>
+      <w:pPr>
+        <w:pStyle w:val="FirstParagraph"/>
+      </w:pPr>
+      <w:r>
+        <w:rPr>
+          <w:bCs/>
+          <w:b/>
+        </w:rPr>
+        <w:t xml:space="preserve">As of 2026-07-19:</w:t>
+      </w:r>
+      <w:r>
+        <w:t xml:space="preserve"> </w:t>
+      </w:r>
+      <w:r>
+        <w:t xml:space="preserve">executed on</w:t>
+      </w:r>
+      <w:r>
+        <w:t xml:space="preserve"> </w:t>
+      </w:r>
+      <w:r>
+        <w:rPr>
+          <w:bCs/>
+          <w:b/>
+        </w:rPr>
+        <w:t xml:space="preserve">three live IBM Heron r2 processors</w:t>
+      </w:r>
+      <w:r>
+        <w:t xml:space="preserve"> </w:t>
+      </w:r>
+      <w:r>
+        <w:t xml:space="preserve">after Derek rotated the</w:t>
+      </w:r>
+      <w:r>
+        <w:t xml:space="preserve"> </w:t>
+      </w:r>
+      <w:r>
+        <w:t xml:space="preserve">IBM token and authorized the run. Manifest lock (</w:t>
+      </w:r>
+      <w:r>
+        <w:rPr>
+          <w:rStyle w:val="VerbatimChar"/>
+        </w:rPr>
+        <w:t xml:space="preserve">MANIFEST-TRINITY-2.sha256</w:t>
+      </w:r>
+      <w:r>
+        <w:t xml:space="preserve">) verified intact</w:t>
+      </w:r>
+      <w:r>
+        <w:t xml:space="preserve"> </w:t>
+      </w:r>
+      <w:r>
+        <w:t xml:space="preserve">before execution. Aggregate verdict</w:t>
+      </w:r>
+      <w:r>
+        <w:t xml:space="preserve"> </w:t>
+      </w:r>
+      <w:r>
+        <w:rPr>
+          <w:bCs/>
+          <w:b/>
+        </w:rPr>
+        <w:t xml:space="preserve">ALLOW</w:t>
+      </w:r>
+      <w:r>
+        <w:t xml:space="preserve"> </w:t>
+      </w:r>
+      <w:r>
+        <w:t xml:space="preserve">→ governed action</w:t>
+      </w:r>
+      <w:r>
+        <w:t xml:space="preserve"> </w:t>
+      </w:r>
+      <w:r>
+        <w:rPr>
+          <w:bCs/>
+          <w:b/>
+        </w:rPr>
+        <w:t xml:space="preserve">AUTHORIZED</w:t>
+      </w:r>
+      <w:r>
+        <w:t xml:space="preserve">; independent</w:t>
+      </w:r>
+      <w:r>
+        <w:t xml:space="preserve"> </w:t>
+      </w:r>
+      <w:r>
+        <w:t xml:space="preserve">verifier</w:t>
+      </w:r>
+      <w:r>
+        <w:t xml:space="preserve"> </w:t>
+      </w:r>
+      <w:r>
+        <w:rPr>
+          <w:bCs/>
+          <w:b/>
+        </w:rPr>
+        <w:t xml:space="preserve">PASS</w:t>
+      </w:r>
+      <w:r>
+        <w:t xml:space="preserve">.</w:t>
+      </w:r>
+    </w:p>
+    <w:p>
+      <w:pPr>
+        <w:pStyle w:val="BodyText"/>
+      </w:pPr>
+      <w:r>
+        <w:t xml:space="preserve">TRINITY-2 extends TRINITY-1 by binding the fused three-processor verdict to a</w:t>
+      </w:r>
+      <w:r>
+        <w:t xml:space="preserve"> </w:t>
+      </w:r>
+      <w:r>
+        <w:rPr>
+          <w:bCs/>
+          <w:b/>
+        </w:rPr>
+        <w:t xml:space="preserve">simulated</w:t>
+      </w:r>
+      <w:r>
+        <w:rPr>
+          <w:bCs/>
+          <w:b/>
+        </w:rPr>
+        <w:t xml:space="preserve"> </w:t>
+      </w:r>
+      <w:r>
+        <w:rPr>
+          <w:bCs/>
+          <w:b/>
+        </w:rPr>
+        <w:t xml:space="preserve">$500,000 payment authorization</w:t>
+      </w:r>
+      <w:r>
+        <w:t xml:space="preserve">, with a preregistered</w:t>
+      </w:r>
+      <w:r>
+        <w:t xml:space="preserve"> </w:t>
+      </w:r>
+      <w:r>
+        <w:rPr>
+          <w:bCs/>
+          <w:b/>
+        </w:rPr>
+        <w:t xml:space="preserve">quorum (≥2 of 3) + substitution /</w:t>
+      </w:r>
+      <w:r>
+        <w:rPr>
+          <w:bCs/>
+          <w:b/>
+        </w:rPr>
+        <w:t xml:space="preserve"> </w:t>
+      </w:r>
+      <w:r>
+        <w:rPr>
+          <w:bCs/>
+          <w:b/>
+        </w:rPr>
+        <w:t xml:space="preserve">failover</w:t>
+      </w:r>
+      <w:r>
+        <w:t xml:space="preserve"> </w:t>
+      </w:r>
+      <w:r>
+        <w:t xml:space="preserve">rule and full</w:t>
+      </w:r>
+      <w:r>
+        <w:t xml:space="preserve"> </w:t>
+      </w:r>
+      <w:r>
+        <w:rPr>
+          <w:bCs/>
+          <w:b/>
+        </w:rPr>
+        <w:t xml:space="preserve">calibration-snapshot hashing</w:t>
+      </w:r>
+      <w:r>
+        <w:t xml:space="preserve">. The payment is simulated — no real</w:t>
+      </w:r>
+      <w:r>
+        <w:t xml:space="preserve"> </w:t>
+      </w:r>
+      <w:r>
+        <w:t xml:space="preserve">funds, rail, or authority.</w:t>
+      </w:r>
+    </w:p>
+    <w:bookmarkStart w:id="20" w:name="X9e0ceb2072990572a7e40ccbfbb7e9de70e8c88"/>
+    <w:p>
+      <w:pPr>
+        <w:pStyle w:val="Heading3"/>
+      </w:pPr>
+      <w:r>
+        <w:t xml:space="preserve">Result (live IBM Heron r2 hardware, 2026-07-19)</w:t>
+      </w:r>
+    </w:p>
+    <w:tbl>
+      <w:tblPr>
+        <w:tblStyle w:val="Table"/>
+        <w:tblW w:type="auto" w:w="0"/>
+        <w:tblLook w:firstRow="1" w:lastRow="0" w:firstColumn="0" w:lastColumn="0" w:noHBand="0" w:noVBand="0" w:val="0020"/>
+      </w:tblPr>
+      <w:tblGrid>
+        <w:gridCol w:w="1584"/>
+        <w:gridCol w:w="1584"/>
+        <w:gridCol w:w="1584"/>
+        <w:gridCol w:w="1584"/>
+        <w:gridCol w:w="1584"/>
+      </w:tblGrid>
+      <w:tr>
+        <w:trPr>
+          <w:tblHeader w:val="true"/>
+        </w:trPr>
+        <w:tc>
+          <w:tcPr/>
+          <w:p>
+            <w:pPr>
+              <w:pStyle w:val="Compact"/>
+              <w:jc w:val="left"/>
+            </w:pPr>
+            <w:r>
+              <w:t xml:space="preserve">Slot</w:t>
+            </w:r>
+          </w:p>
+        </w:tc>
+        <w:tc>
+          <w:tcPr/>
+          <w:p>
+            <w:pPr>
+              <w:pStyle w:val="Compact"/>
+              <w:jc w:val="left"/>
+            </w:pPr>
+            <w:r>
+              <w:t xml:space="preserve">Backend</w:t>
+            </w:r>
+          </w:p>
+        </w:tc>
+        <w:tc>
+          <w:tcPr/>
+          <w:p>
+            <w:pPr>
+              <w:pStyle w:val="Compact"/>
+              <w:jc w:val="left"/>
+            </w:pPr>
+            <w:r>
+              <w:t xml:space="preserve">S</w:t>
+            </w:r>
+          </w:p>
+        </w:tc>
+        <w:tc>
+          <w:tcPr/>
+          <w:p>
+            <w:pPr>
+              <w:pStyle w:val="Compact"/>
+              <w:jc w:val="left"/>
+            </w:pPr>
+            <w:r>
+              <w:t xml:space="preserve">Verdict</w:t>
+            </w:r>
+          </w:p>
+        </w:tc>
+        <w:tc>
+          <w:tcPr/>
+          <w:p>
+            <w:pPr>
+              <w:pStyle w:val="Compact"/>
+              <w:jc w:val="left"/>
+            </w:pPr>
+            <w:r>
+              <w:t xml:space="preserve">Job</w:t>
+            </w:r>
+          </w:p>
+        </w:tc>
+      </w:tr>
+      <w:tr>
+        <w:tc>
+          <w:tcPr/>
+          <w:p>
+            <w:pPr>
+              <w:pStyle w:val="Compact"/>
+              <w:jc w:val="left"/>
+            </w:pPr>
+            <w:r>
+              <w:t xml:space="preserve">D1</w:t>
+            </w:r>
+          </w:p>
+        </w:tc>
+        <w:tc>
+          <w:tcPr/>
+          <w:p>
+            <w:pPr>
+              <w:pStyle w:val="Compact"/>
+              <w:jc w:val="left"/>
+            </w:pPr>
+            <w:r>
+              <w:rPr>
+                <w:rStyle w:val="VerbatimChar"/>
+              </w:rPr>
+              <w:t xml:space="preserve">ibm_kingston</w:t>
+            </w:r>
+          </w:p>
+        </w:tc>
+        <w:tc>
+          <w:tcPr/>
+          <w:p>
+            <w:pPr>
+              <w:pStyle w:val="Compact"/>
+              <w:jc w:val="left"/>
+            </w:pPr>
+            <w:r>
+              <w:t xml:space="preserve">2.7650</w:t>
+            </w:r>
+          </w:p>
+        </w:tc>
+        <w:tc>
+          <w:tcPr/>
+          <w:p>
+            <w:pPr>
+              <w:pStyle w:val="Compact"/>
+              <w:jc w:val="left"/>
+            </w:pPr>
+            <w:r>
+              <w:t xml:space="preserve">PASS</w:t>
+            </w:r>
+          </w:p>
+        </w:tc>
+        <w:tc>
+          <w:tcPr/>
+          <w:p>
+            <w:pPr>
+              <w:pStyle w:val="Compact"/>
+              <w:jc w:val="left"/>
+            </w:pPr>
+            <w:r>
+              <w:rPr>
+                <w:rStyle w:val="VerbatimChar"/>
+              </w:rPr>
+              <w:t xml:space="preserve">d9e7029htsac739dt2mg</w:t>
+            </w:r>
+          </w:p>
+        </w:tc>
+      </w:tr>
+      <w:tr>
+        <w:tc>
+          <w:tcPr/>
+          <w:p>
+            <w:pPr>
+              <w:pStyle w:val="Compact"/>
+              <w:jc w:val="left"/>
+            </w:pPr>
+            <w:r>
+              <w:t xml:space="preserve">D2</w:t>
+            </w:r>
+          </w:p>
+        </w:tc>
+        <w:tc>
+          <w:tcPr/>
+          <w:p>
+            <w:pPr>
+              <w:pStyle w:val="Compact"/>
+              <w:jc w:val="left"/>
+            </w:pPr>
+            <w:r>
+              <w:rPr>
+                <w:rStyle w:val="VerbatimChar"/>
+              </w:rPr>
+              <w:t xml:space="preserve">ibm_fez</w:t>
+            </w:r>
+          </w:p>
+        </w:tc>
+        <w:tc>
+          <w:tcPr/>
+          <w:p>
+            <w:pPr>
+              <w:pStyle w:val="Compact"/>
+              <w:jc w:val="left"/>
+            </w:pPr>
+            <w:r>
+              <w:t xml:space="preserve">2.7235</w:t>
+            </w:r>
+          </w:p>
+        </w:tc>
+        <w:tc>
+          <w:tcPr/>
+          <w:p>
+            <w:pPr>
+              <w:pStyle w:val="Compact"/>
+              <w:jc w:val="left"/>
+            </w:pPr>
+            <w:r>
+              <w:t xml:space="preserve">PASS</w:t>
+            </w:r>
+          </w:p>
+        </w:tc>
+        <w:tc>
+          <w:tcPr/>
+          <w:p>
+            <w:pPr>
+              <w:pStyle w:val="Compact"/>
+              <w:jc w:val="left"/>
+            </w:pPr>
+            <w:r>
+              <w:rPr>
+                <w:rStyle w:val="VerbatimChar"/>
+              </w:rPr>
+              <w:t xml:space="preserve">d9e71lqneu4c739o3otg</w:t>
+            </w:r>
+          </w:p>
+        </w:tc>
+      </w:tr>
+      <w:tr>
+        <w:tc>
+          <w:tcPr/>
+          <w:p>
+            <w:pPr>
+              <w:pStyle w:val="Compact"/>
+              <w:jc w:val="left"/>
+            </w:pPr>
+            <w:r>
+              <w:t xml:space="preserve">D3</w:t>
+            </w:r>
+          </w:p>
+        </w:tc>
+        <w:tc>
+          <w:tcPr/>
+          <w:p>
+            <w:pPr>
+              <w:pStyle w:val="Compact"/>
+              <w:jc w:val="left"/>
+            </w:pPr>
+            <w:r>
+              <w:rPr>
+                <w:rStyle w:val="VerbatimChar"/>
+              </w:rPr>
+              <w:t xml:space="preserve">ibm_marrakesh</w:t>
+            </w:r>
+          </w:p>
+        </w:tc>
+        <w:tc>
+          <w:tcPr/>
+          <w:p>
+            <w:pPr>
+              <w:pStyle w:val="Compact"/>
+              <w:jc w:val="left"/>
+            </w:pPr>
+            <w:r>
+              <w:t xml:space="preserve">2.7235</w:t>
+            </w:r>
+          </w:p>
+        </w:tc>
+        <w:tc>
+          <w:tcPr/>
+          <w:p>
+            <w:pPr>
+              <w:pStyle w:val="Compact"/>
+              <w:jc w:val="left"/>
+            </w:pPr>
+            <w:r>
+              <w:t xml:space="preserve">PASS</w:t>
+            </w:r>
+          </w:p>
+        </w:tc>
+        <w:tc>
+          <w:tcPr/>
+          <w:p>
+            <w:pPr>
+              <w:pStyle w:val="Compact"/>
+              <w:jc w:val="left"/>
+            </w:pPr>
+            <w:r>
+              <w:rPr>
+                <w:rStyle w:val="VerbatimChar"/>
+              </w:rPr>
+              <w:t xml:space="preserve">d9e71pcjeosc73fie1r0</w:t>
+            </w:r>
+          </w:p>
+        </w:tc>
+      </w:tr>
+    </w:tbl>
+    <w:p>
+      <w:pPr>
+        <w:numPr>
+          <w:ilvl w:val="0"/>
+          <w:numId w:val="1001"/>
+        </w:numPr>
+        <w:pStyle w:val="Compact"/>
+      </w:pPr>
+      <w:r>
+        <w:t xml:space="preserve">Shots: 4 CHSH circuits × 4,000 × 3 devices =</w:t>
+      </w:r>
+      <w:r>
+        <w:t xml:space="preserve"> </w:t>
+      </w:r>
+      <w:r>
+        <w:rPr>
+          <w:bCs/>
+          <w:b/>
+        </w:rPr>
+        <w:t xml:space="preserve">48,000 total</w:t>
+      </w:r>
+      <w:r>
+        <w:t xml:space="preserve">. Classical bound |S| ≤ 2.0 ·</w:t>
+      </w:r>
+      <w:r>
+        <w:t xml:space="preserve"> </w:t>
+      </w:r>
+      <w:r>
+        <w:t xml:space="preserve">Tsirelson 2√2 ≈ 2.828.</w:t>
+      </w:r>
+    </w:p>
+    <w:p>
+      <w:pPr>
+        <w:numPr>
+          <w:ilvl w:val="0"/>
+          <w:numId w:val="1001"/>
+        </w:numPr>
+        <w:pStyle w:val="Compact"/>
+      </w:pPr>
+      <w:r>
+        <w:t xml:space="preserve">Quorum: required</w:t>
+      </w:r>
+      <w:r>
+        <w:t xml:space="preserve"> </w:t>
+      </w:r>
+      <w:r>
+        <w:rPr>
+          <w:bCs/>
+          <w:b/>
+        </w:rPr>
+        <w:t xml:space="preserve">2</w:t>
+      </w:r>
+      <w:r>
+        <w:t xml:space="preserve"> </w:t>
+      </w:r>
+      <w:r>
+        <w:t xml:space="preserve">of</w:t>
+      </w:r>
+      <w:r>
+        <w:t xml:space="preserve"> </w:t>
+      </w:r>
+      <w:r>
+        <w:rPr>
+          <w:bCs/>
+          <w:b/>
+        </w:rPr>
+        <w:t xml:space="preserve">3</w:t>
+      </w:r>
+      <w:r>
+        <w:t xml:space="preserve"> </w:t>
+      </w:r>
+      <w:r>
+        <w:t xml:space="preserve">· valid devices</w:t>
+      </w:r>
+      <w:r>
+        <w:t xml:space="preserve"> </w:t>
+      </w:r>
+      <w:r>
+        <w:rPr>
+          <w:bCs/>
+          <w:b/>
+        </w:rPr>
+        <w:t xml:space="preserve">3</w:t>
+      </w:r>
+      <w:r>
+        <w:t xml:space="preserve"> </w:t>
+      </w:r>
+      <w:r>
+        <w:t xml:space="preserve">· degraded_quorum</w:t>
+      </w:r>
+      <w:r>
+        <w:t xml:space="preserve"> </w:t>
+      </w:r>
+      <w:r>
+        <w:rPr>
+          <w:bCs/>
+          <w:b/>
+        </w:rPr>
+        <w:t xml:space="preserve">False</w:t>
+      </w:r>
+      <w:r>
+        <w:t xml:space="preserve">.</w:t>
+      </w:r>
+    </w:p>
+    <w:p>
+      <w:pPr>
+        <w:numPr>
+          <w:ilvl w:val="0"/>
+          <w:numId w:val="1001"/>
+        </w:numPr>
+        <w:pStyle w:val="Compact"/>
+      </w:pPr>
+      <w:r>
+        <w:t xml:space="preserve">Aggregate ExecutionProof verdict:</w:t>
+      </w:r>
+      <w:r>
+        <w:t xml:space="preserve"> </w:t>
+      </w:r>
+      <w:r>
+        <w:rPr>
+          <w:bCs/>
+          <w:b/>
+        </w:rPr>
+        <w:t xml:space="preserve">ALLOW</w:t>
+      </w:r>
+      <w:r>
+        <w:t xml:space="preserve"> </w:t>
+      </w:r>
+      <w:r>
+        <w:t xml:space="preserve">→ governed action</w:t>
+      </w:r>
+      <w:r>
+        <w:t xml:space="preserve"> </w:t>
+      </w:r>
+      <w:r>
+        <w:rPr>
+          <w:bCs/>
+          <w:b/>
+        </w:rPr>
+        <w:t xml:space="preserve">AUTHORIZED</w:t>
+      </w:r>
+      <w:r>
+        <w:t xml:space="preserve"> </w:t>
+      </w:r>
+      <w:r>
+        <w:t xml:space="preserve">·</w:t>
+      </w:r>
+      <w:r>
+        <w:t xml:space="preserve"> </w:t>
+      </w:r>
+      <w:r>
+        <w:rPr>
+          <w:rStyle w:val="VerbatimChar"/>
+        </w:rPr>
+        <w:t xml:space="preserve">trinity_certified = True</w:t>
+      </w:r>
+      <w:r>
+        <w:t xml:space="preserve">.</w:t>
+      </w:r>
+    </w:p>
+    <w:p>
+      <w:pPr>
+        <w:numPr>
+          <w:ilvl w:val="0"/>
+          <w:numId w:val="1001"/>
+        </w:numPr>
+        <w:pStyle w:val="Compact"/>
+      </w:pPr>
+      <w:r>
+        <w:t xml:space="preserve">Fused nonce:</w:t>
+      </w:r>
+      <w:r>
+        <w:t xml:space="preserve"> </w:t>
+      </w:r>
+      <w:r>
+        <w:rPr>
+          <w:rStyle w:val="VerbatimChar"/>
+        </w:rPr>
+        <w:t xml:space="preserve">aa527fe2bb3b6d80e3ec78ab1558521a7b744f94235d805623129acf468602b2</w:t>
+      </w:r>
+    </w:p>
+    <w:p>
+      <w:pPr>
+        <w:numPr>
+          <w:ilvl w:val="0"/>
+          <w:numId w:val="1001"/>
+        </w:numPr>
+        <w:pStyle w:val="Compact"/>
+      </w:pPr>
+      <w:r>
+        <w:t xml:space="preserve">Record hash:</w:t>
+      </w:r>
+      <w:r>
+        <w:t xml:space="preserve"> </w:t>
+      </w:r>
+      <w:r>
+        <w:rPr>
+          <w:rStyle w:val="VerbatimChar"/>
+        </w:rPr>
+        <w:t xml:space="preserve">4f6fa000e2bf3976a1d575267ecf188baf42f1c6caea9e717bf1fc1be6737dd0</w:t>
+      </w:r>
+    </w:p>
+    <w:p>
+      <w:pPr>
+        <w:numPr>
+          <w:ilvl w:val="0"/>
+          <w:numId w:val="1001"/>
+        </w:numPr>
+        <w:pStyle w:val="Compact"/>
+      </w:pPr>
+      <w:r>
+        <w:t xml:space="preserve">Chain link → TRINITY-1 record hash</w:t>
+      </w:r>
+      <w:r>
+        <w:t xml:space="preserve"> </w:t>
+      </w:r>
+      <w:r>
+        <w:rPr>
+          <w:rStyle w:val="VerbatimChar"/>
+        </w:rPr>
+        <w:t xml:space="preserve">8d23accac81791fa10f1dba1be79a132168966c4620fc42d16de656bcf9d688b</w:t>
+      </w:r>
+      <w:r>
+        <w:t xml:space="preserve">.</w:t>
+      </w:r>
+    </w:p>
+    <w:p>
+      <w:pPr>
+        <w:numPr>
+          <w:ilvl w:val="0"/>
+          <w:numId w:val="1001"/>
+        </w:numPr>
+        <w:pStyle w:val="Compact"/>
+      </w:pPr>
+      <w:r>
+        <w:rPr>
+          <w:bCs/>
+          <w:b/>
+        </w:rPr>
+        <w:t xml:space="preserve">Independent verifier (</w:t>
+      </w:r>
+      <w:r>
+        <w:rPr>
+          <w:rStyle w:val="VerbatimChar"/>
+          <w:bCs/>
+          <w:b/>
+        </w:rPr>
+        <w:t xml:space="preserve">trinity2_verify.py</w:t>
+      </w:r>
+      <w:r>
+        <w:rPr>
+          <w:bCs/>
+          <w:b/>
+        </w:rPr>
+        <w:t xml:space="preserve">): PASS</w:t>
+      </w:r>
+      <w:r>
+        <w:t xml:space="preserve"> </w:t>
+      </w:r>
+      <w:r>
+        <w:t xml:space="preserve">— every S, arm verdict,</w:t>
+      </w:r>
+      <w:r>
+        <w:t xml:space="preserve"> </w:t>
+      </w:r>
+      <w:r>
+        <w:rPr>
+          <w:rStyle w:val="VerbatimChar"/>
+        </w:rPr>
+        <w:t xml:space="preserve">device_witness_hash</w:t>
+      </w:r>
+      <w:r>
+        <w:t xml:space="preserve">,</w:t>
+      </w:r>
+      <w:r>
+        <w:t xml:space="preserve"> </w:t>
+      </w:r>
+      <w:r>
+        <w:rPr>
+          <w:rStyle w:val="VerbatimChar"/>
+        </w:rPr>
+        <w:t xml:space="preserve">calibration_snapshot_hash</w:t>
+      </w:r>
+      <w:r>
+        <w:t xml:space="preserve">, quorum, aggregate verdict, the</w:t>
+      </w:r>
+      <w:r>
+        <w:t xml:space="preserve"> </w:t>
+      </w:r>
+      <w:r>
+        <w:t xml:space="preserve">governed-action decision,</w:t>
+      </w:r>
+      <w:r>
+        <w:t xml:space="preserve"> </w:t>
+      </w:r>
+      <w:r>
+        <w:rPr>
+          <w:rStyle w:val="VerbatimChar"/>
+        </w:rPr>
+        <w:t xml:space="preserve">governed_action_hash</w:t>
+      </w:r>
+      <w:r>
+        <w:t xml:space="preserve">,</w:t>
+      </w:r>
+      <w:r>
+        <w:t xml:space="preserve"> </w:t>
+      </w:r>
+      <w:r>
+        <w:rPr>
+          <w:rStyle w:val="VerbatimChar"/>
+        </w:rPr>
+        <w:t xml:space="preserve">fused_nonce</w:t>
+      </w:r>
+      <w:r>
+        <w:t xml:space="preserve">, and</w:t>
+      </w:r>
+      <w:r>
+        <w:t xml:space="preserve"> </w:t>
+      </w:r>
+      <w:r>
+        <w:rPr>
+          <w:rStyle w:val="VerbatimChar"/>
+        </w:rPr>
+        <w:t xml:space="preserve">record_hash</w:t>
+      </w:r>
+      <w:r>
+        <w:t xml:space="preserve"> </w:t>
+      </w:r>
+      <w:r>
+        <w:t xml:space="preserve">reconstructed from raw counts with no qiskit dependency; NIST + chain-link provenance OK.</w:t>
+      </w:r>
+    </w:p>
+    <w:p>
+      <w:pPr>
+        <w:pStyle w:val="FirstParagraph"/>
+      </w:pPr>
+      <w:r>
+        <w:rPr>
+          <w:bCs/>
+          <w:b/>
+        </w:rPr>
+        <w:t xml:space="preserve">Still open:</w:t>
+      </w:r>
+      <w:r>
+        <w:t xml:space="preserve"> </w:t>
+      </w:r>
+      <w:r>
+        <w:t xml:space="preserve">Zenodo publication (pending a rotated Zenodo token — GitHub push done).</w:t>
+      </w:r>
+    </w:p>
+    <w:bookmarkEnd w:id="20"/>
+    <w:bookmarkStart w:id="21" w:name="X96cafdbcfbf181b04222690794da137bc459aec"/>
+    <w:p>
+      <w:pPr>
+        <w:pStyle w:val="Heading3"/>
+      </w:pPr>
+      <w:r>
+        <w:t xml:space="preserve">Simulator validation (retained record — all branches confirmed pre-hardware)</w:t>
+      </w:r>
+    </w:p>
+    <w:p>
+      <w:pPr>
+        <w:pStyle w:val="FirstParagraph"/>
+      </w:pPr>
+      <w:r>
+        <w:rPr>
+          <w:bCs/>
+          <w:b/>
+        </w:rPr>
+        <w:t xml:space="preserve">Simulator validation (three independent noisy aer backends) — all branches confirmed + independently verified:</w:t>
+      </w:r>
+    </w:p>
+    <w:tbl>
+      <w:tblPr>
+        <w:tblStyle w:val="Table"/>
+        <w:tblW w:type="pct" w:w="5000"/>
+        <w:tblLook w:firstRow="1" w:lastRow="0" w:firstColumn="0" w:lastColumn="0" w:noHBand="0" w:noVBand="0" w:val="0020"/>
+      </w:tblPr>
+      <w:tblGrid>
+        <w:gridCol w:w="1584"/>
+        <w:gridCol w:w="1584"/>
+        <w:gridCol w:w="1584"/>
+        <w:gridCol w:w="1584"/>
+        <w:gridCol w:w="1584"/>
+      </w:tblGrid>
+      <w:tr>
+        <w:trPr>
+          <w:tblHeader w:val="true"/>
+        </w:trPr>
+        <w:tc>
+          <w:tcPr/>
+          <w:p>
+            <w:pPr>
+              <w:pStyle w:val="Compact"/>
+              <w:jc w:val="left"/>
+            </w:pPr>
+            <w:r>
+              <w:t xml:space="preserve">Scenario</w:t>
+            </w:r>
+          </w:p>
+        </w:tc>
+        <w:tc>
+          <w:tcPr/>
+          <w:p>
+            <w:pPr>
+              <w:pStyle w:val="Compact"/>
+              <w:jc w:val="left"/>
+            </w:pPr>
+            <w:r>
+              <w:t xml:space="preserve">Devices</w:t>
+            </w:r>
+          </w:p>
+        </w:tc>
+        <w:tc>
+          <w:tcPr/>
+          <w:p>
+            <w:pPr>
+              <w:pStyle w:val="Compact"/>
+              <w:jc w:val="left"/>
+            </w:pPr>
+            <w:r>
+              <w:t xml:space="preserve">Aggregate verdict</w:t>
+            </w:r>
+          </w:p>
+        </w:tc>
+        <w:tc>
+          <w:tcPr/>
+          <w:p>
+            <w:pPr>
+              <w:pStyle w:val="Compact"/>
+              <w:jc w:val="left"/>
+            </w:pPr>
+            <w:r>
+              <w:t xml:space="preserve">Action decision</w:t>
+            </w:r>
+          </w:p>
+        </w:tc>
+        <w:tc>
+          <w:tcPr/>
+          <w:p>
+            <w:pPr>
+              <w:pStyle w:val="Compact"/>
+              <w:jc w:val="left"/>
+            </w:pPr>
+            <w:r>
+              <w:t xml:space="preserve">Verifier</w:t>
+            </w:r>
+          </w:p>
+        </w:tc>
+      </w:tr>
+      <w:tr>
+        <w:tc>
+          <w:tcPr/>
+          <w:p>
+            <w:pPr>
+              <w:pStyle w:val="Compact"/>
+              <w:jc w:val="left"/>
+            </w:pPr>
+            <w:r>
+              <w:t xml:space="preserve">NOMINAL</w:t>
+            </w:r>
+          </w:p>
+        </w:tc>
+        <w:tc>
+          <w:tcPr/>
+          <w:p>
+            <w:pPr>
+              <w:pStyle w:val="Compact"/>
+              <w:jc w:val="left"/>
+            </w:pPr>
+            <w:r>
+              <w:t xml:space="preserve">3× PASS</w:t>
+            </w:r>
+          </w:p>
+        </w:tc>
+        <w:tc>
+          <w:tcPr/>
+          <w:p>
+            <w:pPr>
+              <w:pStyle w:val="Compact"/>
+              <w:jc w:val="left"/>
+            </w:pPr>
+            <w:r>
+              <w:rPr>
+                <w:bCs/>
+                <w:b/>
+              </w:rPr>
+              <w:t xml:space="preserve">ALLOW</w:t>
+            </w:r>
+          </w:p>
+        </w:tc>
+        <w:tc>
+          <w:tcPr/>
+          <w:p>
+            <w:pPr>
+              <w:pStyle w:val="Compact"/>
+              <w:jc w:val="left"/>
+            </w:pPr>
+            <w:r>
+              <w:t xml:space="preserve">AUTHORIZED</w:t>
+            </w:r>
+          </w:p>
+        </w:tc>
+        <w:tc>
+          <w:tcPr/>
+          <w:p>
+            <w:pPr>
+              <w:pStyle w:val="Compact"/>
+              <w:jc w:val="left"/>
+            </w:pPr>
+            <w:r>
+              <w:t xml:space="preserve">PASS</w:t>
+            </w:r>
+          </w:p>
+        </w:tc>
+      </w:tr>
+      <w:tr>
+        <w:tc>
+          <w:tcPr/>
+          <w:p>
+            <w:pPr>
+              <w:pStyle w:val="Compact"/>
+              <w:jc w:val="left"/>
+            </w:pPr>
+            <w:r>
+              <w:t xml:space="preserve">DEGRADED</w:t>
+            </w:r>
+          </w:p>
+        </w:tc>
+        <w:tc>
+          <w:tcPr/>
+          <w:p>
+            <w:pPr>
+              <w:pStyle w:val="Compact"/>
+              <w:jc w:val="left"/>
+            </w:pPr>
+            <w:r>
+              <w:t xml:space="preserve">2× PASS (1 device down)</w:t>
+            </w:r>
+          </w:p>
+        </w:tc>
+        <w:tc>
+          <w:tcPr/>
+          <w:p>
+            <w:pPr>
+              <w:pStyle w:val="Compact"/>
+              <w:jc w:val="left"/>
+            </w:pPr>
+            <w:r>
+              <w:rPr>
+                <w:bCs/>
+                <w:b/>
+              </w:rPr>
+              <w:t xml:space="preserve">HOLD</w:t>
+            </w:r>
+          </w:p>
+        </w:tc>
+        <w:tc>
+          <w:tcPr/>
+          <w:p>
+            <w:pPr>
+              <w:pStyle w:val="Compact"/>
+              <w:jc w:val="left"/>
+            </w:pPr>
+            <w:r>
+              <w:t xml:space="preserve">HELD_FOR_HUMAN_CONFIRMATION</w:t>
+            </w:r>
+          </w:p>
+        </w:tc>
+        <w:tc>
+          <w:tcPr/>
+          <w:p>
+            <w:pPr>
+              <w:pStyle w:val="Compact"/>
+              <w:jc w:val="left"/>
+            </w:pPr>
+            <w:r>
+              <w:t xml:space="preserve">PASS</w:t>
+            </w:r>
+          </w:p>
+        </w:tc>
+      </w:tr>
+      <w:tr>
+        <w:tc>
+          <w:tcPr/>
+          <w:p>
+            <w:pPr>
+              <w:pStyle w:val="Compact"/>
+              <w:jc w:val="left"/>
+            </w:pPr>
+            <w:r>
+              <w:t xml:space="preserve">DENY</w:t>
+            </w:r>
+          </w:p>
+        </w:tc>
+        <w:tc>
+          <w:tcPr/>
+          <w:p>
+            <w:pPr>
+              <w:pStyle w:val="Compact"/>
+              <w:jc w:val="left"/>
+            </w:pPr>
+            <w:r>
+              <w:t xml:space="preserve">2 PASS + 1 dissenting FAIL</w:t>
+            </w:r>
+          </w:p>
+        </w:tc>
+        <w:tc>
+          <w:tcPr/>
+          <w:p>
+            <w:pPr>
+              <w:pStyle w:val="Compact"/>
+              <w:jc w:val="left"/>
+            </w:pPr>
+            <w:r>
+              <w:rPr>
+                <w:bCs/>
+                <w:b/>
+              </w:rPr>
+              <w:t xml:space="preserve">DENY</w:t>
+            </w:r>
+          </w:p>
+        </w:tc>
+        <w:tc>
+          <w:tcPr/>
+          <w:p>
+            <w:pPr>
+              <w:pStyle w:val="Compact"/>
+              <w:jc w:val="left"/>
+            </w:pPr>
+            <w:r>
+              <w:t xml:space="preserve">DENIED</w:t>
+            </w:r>
+          </w:p>
+        </w:tc>
+        <w:tc>
+          <w:tcPr/>
+          <w:p>
+            <w:pPr>
+              <w:pStyle w:val="Compact"/>
+              <w:jc w:val="left"/>
+            </w:pPr>
+            <w:r>
+              <w:t xml:space="preserve">PASS</w:t>
+            </w:r>
+          </w:p>
+        </w:tc>
+      </w:tr>
+      <w:tr>
+        <w:tc>
+          <w:tcPr/>
+          <w:p>
+            <w:pPr>
+              <w:pStyle w:val="Compact"/>
+              <w:jc w:val="left"/>
+            </w:pPr>
+            <w:r>
+              <w:t xml:space="preserve">GATE-STOP</w:t>
+            </w:r>
+          </w:p>
+        </w:tc>
+        <w:tc>
+          <w:tcPr/>
+          <w:p>
+            <w:pPr>
+              <w:pStyle w:val="Compact"/>
+              <w:jc w:val="left"/>
+            </w:pPr>
+            <w:r>
+              <w:t xml:space="preserve">1 device (sub-quorum)</w:t>
+            </w:r>
+          </w:p>
+        </w:tc>
+        <w:tc>
+          <w:tcPr/>
+          <w:p>
+            <w:pPr>
+              <w:pStyle w:val="Compact"/>
+              <w:jc w:val="left"/>
+            </w:pPr>
+            <w:r>
+              <w:rPr>
+                <w:bCs/>
+                <w:b/>
+              </w:rPr>
+              <w:t xml:space="preserve">GATE-STOP</w:t>
+            </w:r>
+          </w:p>
+        </w:tc>
+        <w:tc>
+          <w:tcPr/>
+          <w:p>
+            <w:pPr>
+              <w:pStyle w:val="Compact"/>
+              <w:jc w:val="left"/>
+            </w:pPr>
+            <w:r>
+              <w:t xml:space="preserve">DENIED</w:t>
+            </w:r>
+          </w:p>
+        </w:tc>
+        <w:tc>
+          <w:tcPr/>
+          <w:p>
+            <w:pPr>
+              <w:pStyle w:val="Compact"/>
+              <w:jc w:val="left"/>
+            </w:pPr>
+            <w:r>
+              <w:t xml:space="preserve">PASS</w:t>
+            </w:r>
+          </w:p>
+        </w:tc>
+      </w:tr>
+      <w:tr>
+        <w:tc>
+          <w:tcPr/>
+          <w:p>
+            <w:pPr>
+              <w:pStyle w:val="Compact"/>
+              <w:jc w:val="left"/>
+            </w:pPr>
+            <w:r>
+              <w:t xml:space="preserve">TAMPER</w:t>
+            </w:r>
+          </w:p>
+        </w:tc>
+        <w:tc>
+          <w:tcPr/>
+          <w:p>
+            <w:pPr>
+              <w:pStyle w:val="Compact"/>
+              <w:jc w:val="left"/>
+            </w:pPr>
+            <w:r>
+              <w:t xml:space="preserve">flip a raw count post-hoc</w:t>
+            </w:r>
+          </w:p>
+        </w:tc>
+        <w:tc>
+          <w:tcPr/>
+          <w:p>
+            <w:pPr>
+              <w:pStyle w:val="Compact"/>
+              <w:jc w:val="left"/>
+            </w:pPr>
+            <w:r>
+              <w:t xml:space="preserve">(recompute)</w:t>
+            </w:r>
+          </w:p>
+        </w:tc>
+        <w:tc>
+          <w:tcPr/>
+          <w:p>
+            <w:pPr>
+              <w:pStyle w:val="Compact"/>
+              <w:jc w:val="left"/>
+            </w:pPr>
+            <w:r>
+              <w:t xml:space="preserve">—</w:t>
+            </w:r>
+          </w:p>
+        </w:tc>
+        <w:tc>
+          <w:tcPr/>
+          <w:p>
+            <w:pPr>
+              <w:pStyle w:val="Compact"/>
+              <w:jc w:val="left"/>
+            </w:pPr>
+            <w:r>
+              <w:rPr>
+                <w:bCs/>
+                <w:b/>
+              </w:rPr>
+              <w:t xml:space="preserve">FAIL as required</w:t>
+            </w:r>
+            <w:r>
+              <w:t xml:space="preserve"> </w:t>
+            </w:r>
+            <w:r>
+              <w:t xml:space="preserve">(record_hash mismatch caught)</w:t>
+            </w:r>
+          </w:p>
+        </w:tc>
+      </w:tr>
+      <w:tr>
+        <w:tc>
+          <w:tcPr/>
+          <w:p>
+            <w:pPr>
+              <w:pStyle w:val="Compact"/>
+              <w:jc w:val="left"/>
+            </w:pPr>
+            <w:r>
+              <w:t xml:space="preserve">TAMPER</w:t>
+            </w:r>
+          </w:p>
+        </w:tc>
+        <w:tc>
+          <w:tcPr/>
+          <w:p>
+            <w:pPr>
+              <w:pStyle w:val="Compact"/>
+              <w:jc w:val="left"/>
+            </w:pPr>
+            <w:r>
+              <w:t xml:space="preserve">force decision AUTHORIZED under DENY</w:t>
+            </w:r>
+          </w:p>
+        </w:tc>
+        <w:tc>
+          <w:tcPr/>
+          <w:p>
+            <w:pPr>
+              <w:pStyle w:val="Compact"/>
+              <w:jc w:val="left"/>
+            </w:pPr>
+            <w:r>
+              <w:t xml:space="preserve">(recompute)</w:t>
+            </w:r>
+          </w:p>
+        </w:tc>
+        <w:tc>
+          <w:tcPr/>
+          <w:p>
+            <w:pPr>
+              <w:pStyle w:val="Compact"/>
+              <w:jc w:val="left"/>
+            </w:pPr>
+            <w:r>
+              <w:t xml:space="preserve">—</w:t>
+            </w:r>
+          </w:p>
+        </w:tc>
+        <w:tc>
+          <w:tcPr/>
+          <w:p>
+            <w:pPr>
+              <w:pStyle w:val="Compact"/>
+              <w:jc w:val="left"/>
+            </w:pPr>
+            <w:r>
+              <w:rPr>
+                <w:bCs/>
+                <w:b/>
+              </w:rPr>
+              <w:t xml:space="preserve">FAIL as required</w:t>
+            </w:r>
+          </w:p>
+        </w:tc>
+      </w:tr>
+    </w:tbl>
+    <w:p>
+      <w:pPr>
+        <w:numPr>
+          <w:ilvl w:val="0"/>
+          <w:numId w:val="1002"/>
+        </w:numPr>
+        <w:pStyle w:val="Compact"/>
+      </w:pPr>
+      <w:r>
+        <w:t xml:space="preserve">Kill-condition self-check active: harness exits non-zero if it ever emits ALLOW while a device</w:t>
+      </w:r>
+      <w:r>
+        <w:t xml:space="preserve"> </w:t>
+      </w:r>
+      <w:r>
+        <w:t xml:space="preserve">is not PASS, under degraded quorum, or with fewer than 3 distinct devices.</w:t>
+      </w:r>
+    </w:p>
+    <w:p>
+      <w:pPr>
+        <w:numPr>
+          <w:ilvl w:val="0"/>
+          <w:numId w:val="1002"/>
+        </w:numPr>
+        <w:pStyle w:val="Compact"/>
+      </w:pPr>
+      <w:r>
+        <w:t xml:space="preserve">Independent verifier reconstructs every S, arm verdict,</w:t>
+      </w:r>
+      <w:r>
+        <w:t xml:space="preserve"> </w:t>
+      </w:r>
+      <w:r>
+        <w:rPr>
+          <w:rStyle w:val="VerbatimChar"/>
+        </w:rPr>
+        <w:t xml:space="preserve">device_witness_hash</w:t>
+      </w:r>
+      <w:r>
+        <w:t xml:space="preserve">,</w:t>
+      </w:r>
+      <w:r>
+        <w:t xml:space="preserve"> </w:t>
+      </w:r>
+      <w:r>
+        <w:rPr>
+          <w:rStyle w:val="VerbatimChar"/>
+        </w:rPr>
+        <w:t xml:space="preserve">calibration_snapshot_hash</w:t>
+      </w:r>
+      <w:r>
+        <w:t xml:space="preserve">, quorum, aggregate verdict,</w:t>
+      </w:r>
+      <w:r>
+        <w:t xml:space="preserve"> </w:t>
+      </w:r>
+      <w:r>
+        <w:rPr>
+          <w:bCs/>
+          <w:b/>
+        </w:rPr>
+        <w:t xml:space="preserve">the governed-action decision</w:t>
+      </w:r>
+      <w:r>
+        <w:t xml:space="preserve">,</w:t>
+      </w:r>
+      <w:r>
+        <w:t xml:space="preserve"> </w:t>
+      </w:r>
+      <w:r>
+        <w:rPr>
+          <w:rStyle w:val="VerbatimChar"/>
+        </w:rPr>
+        <w:t xml:space="preserve">governed_action_hash</w:t>
+      </w:r>
+      <w:r>
+        <w:t xml:space="preserve">,</w:t>
+      </w:r>
+      <w:r>
+        <w:t xml:space="preserve"> </w:t>
+      </w:r>
+      <w:r>
+        <w:rPr>
+          <w:rStyle w:val="VerbatimChar"/>
+        </w:rPr>
+        <w:t xml:space="preserve">fused_nonce</w:t>
+      </w:r>
+      <w:r>
+        <w:t xml:space="preserve">, and</w:t>
+      </w:r>
+      <w:r>
+        <w:t xml:space="preserve"> </w:t>
+      </w:r>
+      <w:r>
+        <w:rPr>
+          <w:rStyle w:val="VerbatimChar"/>
+        </w:rPr>
+        <w:t xml:space="preserve">record_hash</w:t>
+      </w:r>
+      <w:r>
+        <w:t xml:space="preserve"> </w:t>
+      </w:r>
+      <w:r>
+        <w:t xml:space="preserve">from raw counts — no qiskit.</w:t>
+      </w:r>
+    </w:p>
+    <w:p>
+      <w:pPr>
+        <w:numPr>
+          <w:ilvl w:val="0"/>
+          <w:numId w:val="1002"/>
+        </w:numPr>
+        <w:pStyle w:val="Compact"/>
+      </w:pPr>
+      <w:r>
+        <w:t xml:space="preserve">Schema</w:t>
+      </w:r>
+      <w:r>
+        <w:t xml:space="preserve"> </w:t>
+      </w:r>
+      <w:r>
+        <w:rPr>
+          <w:rStyle w:val="VerbatimChar"/>
+        </w:rPr>
+        <w:t xml:space="preserve">trinity-proofrecord-2.0</w:t>
+      </w:r>
+      <w:r>
+        <w:t xml:space="preserve">. Chain link → TRINITY-1 record hash</w:t>
+      </w:r>
+      <w:r>
+        <w:t xml:space="preserve"> </w:t>
+      </w:r>
+      <w:r>
+        <w:rPr>
+          <w:rStyle w:val="VerbatimChar"/>
+        </w:rPr>
+        <w:t xml:space="preserve">8d23accac81791fa10f1dba1be79a132168966c4620fc42d16de656bcf9d688b</w:t>
+      </w:r>
+      <w:r>
+        <w:t xml:space="preserve">.</w:t>
+      </w:r>
+    </w:p>
+    <w:p>
+      <w:pPr>
+        <w:pStyle w:val="FirstParagraph"/>
+      </w:pPr>
+      <w:r>
+        <w:rPr>
+          <w:bCs/>
+          <w:b/>
+        </w:rPr>
+        <w:t xml:space="preserve">Next (needs Derek):</w:t>
+      </w:r>
+      <w:r>
+        <w:t xml:space="preserve"> </w:t>
+      </w:r>
+      <w:r>
+        <w:t xml:space="preserve">approve → rotate IBM token → run</w:t>
+      </w:r>
+      <w:r>
+        <w:t xml:space="preserve"> </w:t>
+      </w:r>
+      <w:r>
+        <w:rPr>
+          <w:rStyle w:val="VerbatimChar"/>
+        </w:rPr>
+        <w:t xml:space="preserve">python3 trinity2_harness.py --authorize-hardware --allow-unrotated</w:t>
+      </w:r>
+      <w:r>
+        <w:t xml:space="preserve"> </w:t>
+      </w:r>
+      <w:r>
+        <w:t xml:space="preserve">with</w:t>
+      </w:r>
+      <w:r>
+        <w:t xml:space="preserve"> </w:t>
+      </w:r>
+      <w:r>
+        <w:rPr>
+          <w:rStyle w:val="VerbatimChar"/>
+        </w:rPr>
+        <w:t xml:space="preserve">IBM_QUANTUM_TOKEN</w:t>
+      </w:r>
+      <w:r>
+        <w:t xml:space="preserve"> </w:t>
+      </w:r>
+      <w:r>
+        <w:t xml:space="preserve">set → verify → publish.</w:t>
+      </w:r>
+    </w:p>
+    <w:p>
+      <w:r>
+        <w:pict>
+          <v:rect style="width:0;height:1.5pt" o:hralign="center" o:hrstd="t" o:hr="t"/>
+        </w:pict>
+      </w:r>
+    </w:p>
+    <w:bookmarkEnd w:id="21"/>
+    <w:bookmarkEnd w:id="22"/>
+    <w:bookmarkStart w:id="23" w:name="X43b92c375c55ab2d4745cf815f56f8611b42a3f"/>
+    <w:p>
+      <w:pPr>
+        <w:pStyle w:val="Heading2"/>
+      </w:pPr>
+      <w:r>
+        <w:t xml:space="preserve">TRINITY-1 — The Three-Processor Witness — HARDWARE COMPLETE</w:t>
+      </w:r>
+    </w:p>
+    <w:p>
+      <w:pPr>
+        <w:pStyle w:val="FirstParagraph"/>
+      </w:pPr>
       <w:r>
         <w:rPr>
           <w:bCs/>
@@ -65,7 +1623,8 @@
         <w:t xml:space="preserve">.</w:t>
       </w:r>
     </w:p>
-    <w:bookmarkStart w:id="20" w:name="result-live-ibm-heron-r2-hardware"/>
+    <w:bookmarkEnd w:id="23"/>
+    <w:bookmarkStart w:id="24" w:name="result-live-ibm-heron-r2-hardware"/>
     <w:p>
       <w:pPr>
         <w:pStyle w:val="Heading2"/>
@@ -424,772 +1983,124 @@
       <w:pPr>
         <w:numPr>
           <w:ilvl w:val="0"/>
-          <w:numId w:val="1001"/>
-        </w:numPr>
-        <w:pStyle w:val="Compact"/>
-      </w:pPr>
-      <w:r>
-        <w:t xml:space="preserve">Classical bound |S| ≤ 2.0 · Tsirelson 2√2 ≈ 2.828 · certification threshold S ≥ 2.2.</w:t>
-      </w:r>
-    </w:p>
-    <w:p>
-      <w:pPr>
-        <w:numPr>
-          <w:ilvl w:val="0"/>
-          <w:numId w:val="1001"/>
-        </w:numPr>
-        <w:pStyle w:val="Compact"/>
-      </w:pPr>
-      <w:r>
-        <w:t xml:space="preserve">Aggregate ExecutionProof verdict:</w:t>
-      </w:r>
-      <w:r>
-        <w:t xml:space="preserve"> </w:t>
-      </w:r>
-      <w:r>
-        <w:rPr>
-          <w:bCs/>
-          <w:b/>
-        </w:rPr>
-        <w:t xml:space="preserve">ALLOW</w:t>
-      </w:r>
-      <w:r>
-        <w:t xml:space="preserve"> </w:t>
-      </w:r>
-      <w:r>
-        <w:t xml:space="preserve">·</w:t>
-      </w:r>
-      <w:r>
-        <w:t xml:space="preserve"> </w:t>
-      </w:r>
-      <w:r>
-        <w:rPr>
-          <w:rStyle w:val="VerbatimChar"/>
-        </w:rPr>
-        <w:t xml:space="preserve">trinity_certified = True</w:t>
-      </w:r>
-    </w:p>
-    <w:p>
-      <w:pPr>
-        <w:numPr>
-          <w:ilvl w:val="0"/>
-          <w:numId w:val="1001"/>
-        </w:numPr>
-        <w:pStyle w:val="Compact"/>
-      </w:pPr>
-      <w:r>
-        <w:t xml:space="preserve">TRINITY nonce:</w:t>
-      </w:r>
-      <w:r>
-        <w:t xml:space="preserve"> </w:t>
-      </w:r>
-      <w:r>
-        <w:rPr>
-          <w:rStyle w:val="VerbatimChar"/>
-        </w:rPr>
-        <w:t xml:space="preserve">508f0ad692a7bd3a1d1a069aa02f4dc2519560153f646220f2150bbe47270e2f</w:t>
-      </w:r>
-    </w:p>
-    <w:p>
-      <w:pPr>
-        <w:numPr>
-          <w:ilvl w:val="0"/>
-          <w:numId w:val="1001"/>
-        </w:numPr>
-        <w:pStyle w:val="Compact"/>
-      </w:pPr>
-      <w:r>
-        <w:t xml:space="preserve">Record hash:</w:t>
-      </w:r>
-      <w:r>
-        <w:t xml:space="preserve"> </w:t>
-      </w:r>
-      <w:r>
-        <w:rPr>
-          <w:rStyle w:val="VerbatimChar"/>
-        </w:rPr>
-        <w:t xml:space="preserve">8d23accac81791fa10f1dba1be79a132168966c4620fc42d16de656bcf9d688b</w:t>
-      </w:r>
-    </w:p>
-    <w:p>
-      <w:pPr>
-        <w:numPr>
-          <w:ilvl w:val="0"/>
-          <w:numId w:val="1001"/>
-        </w:numPr>
-        <w:pStyle w:val="Compact"/>
-      </w:pPr>
-      <w:r>
-        <w:t xml:space="preserve">Chain — previous record (OMNI-1):</w:t>
-      </w:r>
-      <w:r>
-        <w:t xml:space="preserve"> </w:t>
-      </w:r>
-      <w:r>
-        <w:rPr>
-          <w:rStyle w:val="VerbatimChar"/>
-        </w:rPr>
-        <w:t xml:space="preserve">22ffb2ba137c89c2846225c6d5a11fb2a4dc6aaa6a0ba1dfe6864bc50393bb0c</w:t>
-      </w:r>
-    </w:p>
-    <w:p>
-      <w:pPr>
-        <w:numPr>
-          <w:ilvl w:val="0"/>
-          <w:numId w:val="1001"/>
-        </w:numPr>
-        <w:pStyle w:val="Compact"/>
-      </w:pPr>
-      <w:r>
-        <w:t xml:space="preserve">NIST beacon pulse:</w:t>
-      </w:r>
-      <w:r>
-        <w:t xml:space="preserve"> </w:t>
-      </w:r>
-      <w:r>
-        <w:rPr>
-          <w:rStyle w:val="VerbatimChar"/>
-        </w:rPr>
-        <w:t xml:space="preserve">1865761</w:t>
-      </w:r>
-      <w:r>
-        <w:t xml:space="preserve"> </w:t>
-      </w:r>
-      <w:r>
-        <w:t xml:space="preserve">@ 2026-07-19T03:21:00.000Z</w:t>
-      </w:r>
-    </w:p>
-    <w:p>
-      <w:pPr>
-        <w:numPr>
-          <w:ilvl w:val="0"/>
-          <w:numId w:val="1001"/>
-        </w:numPr>
-        <w:pStyle w:val="Compact"/>
-      </w:pPr>
-      <w:r>
-        <w:t xml:space="preserve">Shots: 4,000 per circuit × 4 circuits × 3 devices =</w:t>
-      </w:r>
-      <w:r>
-        <w:t xml:space="preserve"> </w:t>
-      </w:r>
-      <w:r>
-        <w:rPr>
-          <w:bCs/>
-          <w:b/>
-        </w:rPr>
-        <w:t xml:space="preserve">48,000</w:t>
-      </w:r>
-      <w:r>
-        <w:t xml:space="preserve"> </w:t>
-      </w:r>
-      <w:r>
-        <w:t xml:space="preserve">total (matches prereg + locked</w:t>
-      </w:r>
-      <w:r>
-        <w:t xml:space="preserve"> </w:t>
-      </w:r>
-      <w:r>
-        <w:t xml:space="preserve">harness</w:t>
-      </w:r>
-      <w:r>
-        <w:t xml:space="preserve"> </w:t>
-      </w:r>
-      <w:r>
-        <w:rPr>
-          <w:rStyle w:val="VerbatimChar"/>
-        </w:rPr>
-        <w:t xml:space="preserve">--shots</w:t>
-      </w:r>
-      <w:r>
-        <w:t xml:space="preserve"> </w:t>
-      </w:r>
-      <w:r>
-        <w:t xml:space="preserve">default; OMNI shot-count-consistency lesson honored).</w:t>
-      </w:r>
-    </w:p>
-    <w:p>
-      <w:pPr>
-        <w:numPr>
-          <w:ilvl w:val="0"/>
-          <w:numId w:val="1001"/>
-        </w:numPr>
-        <w:pStyle w:val="Compact"/>
-      </w:pPr>
-      <w:r>
-        <w:rPr>
-          <w:bCs/>
-          <w:b/>
-        </w:rPr>
-        <w:t xml:space="preserve">Independent verifier: PASS</w:t>
-      </w:r>
-      <w:r>
-        <w:t xml:space="preserve"> </w:t>
-      </w:r>
-      <w:r>
-        <w:t xml:space="preserve">(recomputes every S, verdict, witness hash, nonce, record</w:t>
-      </w:r>
-      <w:r>
-        <w:t xml:space="preserve"> </w:t>
-      </w:r>
-      <w:r>
-        <w:t xml:space="preserve">hash, and the aggregate verdict from raw counts — no qiskit).</w:t>
-      </w:r>
-    </w:p>
-    <w:bookmarkEnd w:id="20"/>
-    <w:bookmarkStart w:id="21" w:name="completed"/>
-    <w:p>
-      <w:pPr>
-        <w:pStyle w:val="Heading2"/>
-      </w:pPr>
-      <w:r>
-        <w:t xml:space="preserve">Completed</w:t>
-      </w:r>
-    </w:p>
-    <w:p>
-      <w:pPr>
-        <w:numPr>
-          <w:ilvl w:val="0"/>
-          <w:numId w:val="1002"/>
-        </w:numPr>
-        <w:pStyle w:val="Compact"/>
-      </w:pPr>
-      <w:r>
-        <w:t xml:space="preserve">☒</w:t>
-      </w:r>
-      <w:r>
-        <w:t xml:space="preserve"> </w:t>
-      </w:r>
-      <w:r>
-        <w:rPr>
-          <w:bCs/>
-          <w:b/>
-        </w:rPr>
-        <w:t xml:space="preserve">Preregistration</w:t>
-      </w:r>
-      <w:r>
-        <w:t xml:space="preserve"> </w:t>
-      </w:r>
-      <w:r>
-        <w:t xml:space="preserve">(</w:t>
-      </w:r>
-      <w:r>
-        <w:rPr>
-          <w:rStyle w:val="VerbatimChar"/>
-        </w:rPr>
-        <w:t xml:space="preserve">TRINITY-1-preregistration.md</w:t>
-      </w:r>
-      <w:r>
-        <w:t xml:space="preserve">) — three-processor design, identical</w:t>
-      </w:r>
-      <w:r>
-        <w:t xml:space="preserve"> </w:t>
-      </w:r>
-      <w:r>
-        <w:t xml:space="preserve">CHSH witness, per-device + aggregate verdict logic (ALLOW/HOLD/DENY/GATE-STOP), fused</w:t>
-      </w:r>
-      <w:r>
-        <w:t xml:space="preserve"> </w:t>
-      </w:r>
-      <w:r>
-        <w:rPr>
-          <w:rStyle w:val="VerbatimChar"/>
-        </w:rPr>
-        <w:t xml:space="preserve">trinity_nonce</w:t>
-      </w:r>
-      <w:r>
-        <w:t xml:space="preserve">, kill condition, hardware gate, scope/honesty caveats, purpose gate.</w:t>
-      </w:r>
-    </w:p>
-    <w:p>
-      <w:pPr>
-        <w:numPr>
-          <w:ilvl w:val="0"/>
-          <w:numId w:val="1002"/>
-        </w:numPr>
-        <w:pStyle w:val="Compact"/>
-      </w:pPr>
-      <w:r>
-        <w:t xml:space="preserve">☒</w:t>
-      </w:r>
-      <w:r>
-        <w:t xml:space="preserve"> </w:t>
-      </w:r>
-      <w:r>
-        <w:rPr>
-          <w:bCs/>
-          <w:b/>
-        </w:rPr>
-        <w:t xml:space="preserve">Harness</w:t>
-      </w:r>
-      <w:r>
-        <w:t xml:space="preserve"> </w:t>
-      </w:r>
-      <w:r>
-        <w:t xml:space="preserve">(</w:t>
-      </w:r>
-      <w:r>
-        <w:rPr>
-          <w:rStyle w:val="VerbatimChar"/>
-        </w:rPr>
-        <w:t xml:space="preserve">trinity_harness.py</w:t>
-      </w:r>
-      <w:r>
-        <w:t xml:space="preserve">) — builds the CHSH witness, runs three independent</w:t>
-      </w:r>
-      <w:r>
-        <w:t xml:space="preserve"> </w:t>
-      </w:r>
-      <w:r>
-        <w:t xml:space="preserve">devices (simulator or hardware), assembles the</w:t>
-      </w:r>
-      <w:r>
-        <w:t xml:space="preserve"> </w:t>
-      </w:r>
-      <w:r>
-        <w:rPr>
-          <w:rStyle w:val="VerbatimChar"/>
-        </w:rPr>
-        <w:t xml:space="preserve">trinity-proofrecord-1.0</w:t>
-      </w:r>
-      <w:r>
-        <w:t xml:space="preserve"> </w:t>
-      </w:r>
-      <w:r>
-        <w:t xml:space="preserve">record, computes</w:t>
-      </w:r>
-      <w:r>
-        <w:t xml:space="preserve"> </w:t>
-      </w:r>
-      <w:r>
-        <w:t xml:space="preserve">the aggregate ExecutionProof verdict, writes report + JSON. Records the</w:t>
-      </w:r>
-      <w:r>
-        <w:t xml:space="preserve"> </w:t>
-      </w:r>
-      <w:r>
-        <w:rPr>
-          <w:bCs/>
-          <w:b/>
-        </w:rPr>
-        <w:t xml:space="preserve">actual physical</w:t>
-      </w:r>
-      <w:r>
-        <w:rPr>
-          <w:bCs/>
-          <w:b/>
-        </w:rPr>
-        <w:t xml:space="preserve"> </w:t>
-      </w:r>
-      <w:r>
-        <w:rPr>
-          <w:bCs/>
-          <w:b/>
-        </w:rPr>
-        <w:t xml:space="preserve">qubits</w:t>
-      </w:r>
-      <w:r>
-        <w:t xml:space="preserve"> </w:t>
-      </w:r>
-      <w:r>
-        <w:t xml:space="preserve">used after transpilation per circuit (post-layout).</w:t>
-      </w:r>
-    </w:p>
-    <w:p>
-      <w:pPr>
-        <w:numPr>
-          <w:ilvl w:val="0"/>
-          <w:numId w:val="1002"/>
-        </w:numPr>
-        <w:pStyle w:val="Compact"/>
-      </w:pPr>
-      <w:r>
-        <w:t xml:space="preserve">☒</w:t>
-      </w:r>
-      <w:r>
-        <w:t xml:space="preserve"> </w:t>
-      </w:r>
-      <w:r>
-        <w:rPr>
-          <w:bCs/>
-          <w:b/>
-        </w:rPr>
-        <w:t xml:space="preserve">Independent verifier</w:t>
-      </w:r>
-      <w:r>
-        <w:t xml:space="preserve"> </w:t>
-      </w:r>
-      <w:r>
-        <w:t xml:space="preserve">(</w:t>
-      </w:r>
-      <w:r>
-        <w:rPr>
-          <w:rStyle w:val="VerbatimChar"/>
-        </w:rPr>
-        <w:t xml:space="preserve">trinity_verify.py</w:t>
-      </w:r>
-      <w:r>
-        <w:t xml:space="preserve">) — reconstructs every device S, verdict,</w:t>
-      </w:r>
-      <w:r>
-        <w:t xml:space="preserve"> </w:t>
-      </w:r>
-      <w:r>
-        <w:rPr>
-          <w:rStyle w:val="VerbatimChar"/>
-        </w:rPr>
-        <w:t xml:space="preserve">device_witness_hash</w:t>
-      </w:r>
-      <w:r>
-        <w:t xml:space="preserve">,</w:t>
-      </w:r>
-      <w:r>
-        <w:t xml:space="preserve"> </w:t>
-      </w:r>
-      <w:r>
-        <w:rPr>
-          <w:rStyle w:val="VerbatimChar"/>
-        </w:rPr>
-        <w:t xml:space="preserve">trinity_nonce</w:t>
-      </w:r>
-      <w:r>
-        <w:t xml:space="preserve">, and</w:t>
-      </w:r>
-      <w:r>
-        <w:t xml:space="preserve"> </w:t>
-      </w:r>
-      <w:r>
-        <w:rPr>
-          <w:rStyle w:val="VerbatimChar"/>
-        </w:rPr>
-        <w:t xml:space="preserve">record_hash</w:t>
-      </w:r>
-      <w:r>
-        <w:t xml:space="preserve"> </w:t>
-      </w:r>
-      <w:r>
-        <w:t xml:space="preserve">from raw counts, no qiskit.</w:t>
-      </w:r>
-    </w:p>
-    <w:p>
-      <w:pPr>
-        <w:numPr>
-          <w:ilvl w:val="0"/>
-          <w:numId w:val="1002"/>
-        </w:numPr>
-        <w:pStyle w:val="Compact"/>
-      </w:pPr>
-      <w:r>
-        <w:t xml:space="preserve">☒</w:t>
-      </w:r>
-      <w:r>
-        <w:t xml:space="preserve"> </w:t>
-      </w:r>
-      <w:r>
-        <w:rPr>
-          <w:bCs/>
-          <w:b/>
-        </w:rPr>
-        <w:t xml:space="preserve">Preregistration + harness lock</w:t>
-      </w:r>
-      <w:r>
-        <w:t xml:space="preserve"> </w:t>
-      </w:r>
-      <w:r>
-        <w:t xml:space="preserve">(</w:t>
-      </w:r>
-      <w:r>
-        <w:rPr>
-          <w:rStyle w:val="VerbatimChar"/>
-        </w:rPr>
-        <w:t xml:space="preserve">MANIFEST.sha256</w:t>
-      </w:r>
-      <w:r>
-        <w:t xml:space="preserve">) — SHA-256, re-verified</w:t>
-      </w:r>
-      <w:r>
-        <w:t xml:space="preserve"> </w:t>
-      </w:r>
-      <w:r>
-        <w:rPr>
-          <w:rStyle w:val="VerbatimChar"/>
-        </w:rPr>
-        <w:t xml:space="preserve">OK</w:t>
-      </w:r>
-      <w:r>
-        <w:t xml:space="preserve">.</w:t>
-      </w:r>
-    </w:p>
-    <w:p>
-      <w:pPr>
-        <w:numPr>
-          <w:ilvl w:val="0"/>
-          <w:numId w:val="1002"/>
-        </w:numPr>
-        <w:pStyle w:val="Compact"/>
-      </w:pPr>
-      <w:r>
-        <w:t xml:space="preserve">☒</w:t>
-      </w:r>
-      <w:r>
-        <w:t xml:space="preserve"> </w:t>
-      </w:r>
-      <w:r>
-        <w:rPr>
-          <w:bCs/>
-          <w:b/>
-        </w:rPr>
-        <w:t xml:space="preserve">Simulator validation</w:t>
-      </w:r>
-      <w:r>
-        <w:t xml:space="preserve"> </w:t>
-      </w:r>
-      <w:r>
-        <w:t xml:space="preserve">— three independent noisy aer backends:</w:t>
-      </w:r>
-    </w:p>
-    <w:p>
-      <w:pPr>
-        <w:numPr>
-          <w:ilvl w:val="1"/>
           <w:numId w:val="1003"/>
         </w:numPr>
         <w:pStyle w:val="Compact"/>
       </w:pPr>
       <w:r>
-        <w:rPr>
-          <w:bCs/>
-          <w:b/>
-        </w:rPr>
-        <w:t xml:space="preserve">NOMINAL</w:t>
-      </w:r>
-      <w:r>
-        <w:t xml:space="preserve"> </w:t>
-      </w:r>
-      <w:r>
-        <w:t xml:space="preserve">→ all three VALID_ABOVE →</w:t>
-      </w:r>
-      <w:r>
-        <w:t xml:space="preserve"> </w:t>
-      </w:r>
-      <w:r>
-        <w:rPr>
-          <w:bCs/>
-          <w:b/>
-        </w:rPr>
-        <w:t xml:space="preserve">ALLOW</w:t>
-      </w:r>
-      <w:r>
-        <w:t xml:space="preserve">; verifier</w:t>
-      </w:r>
-      <w:r>
-        <w:t xml:space="preserve"> </w:t>
-      </w:r>
-      <w:r>
-        <w:rPr>
-          <w:bCs/>
-          <w:b/>
-        </w:rPr>
-        <w:t xml:space="preserve">PASS</w:t>
-      </w:r>
-      <w:r>
-        <w:t xml:space="preserve">.</w:t>
+        <w:t xml:space="preserve">Classical bound |S| ≤ 2.0 · Tsirelson 2√2 ≈ 2.828 · certification threshold S ≥ 2.2.</w:t>
       </w:r>
     </w:p>
     <w:p>
       <w:pPr>
         <w:numPr>
-          <w:ilvl w:val="1"/>
+          <w:ilvl w:val="0"/>
           <w:numId w:val="1003"/>
         </w:numPr>
         <w:pStyle w:val="Compact"/>
       </w:pPr>
       <w:r>
-        <w:rPr>
-          <w:bCs/>
-          <w:b/>
-        </w:rPr>
-        <w:t xml:space="preserve">HOLD</w:t>
-      </w:r>
-      <w:r>
-        <w:t xml:space="preserve"> </w:t>
-      </w:r>
-      <w:r>
-        <w:t xml:space="preserve">scenario → device 3 driven to INCONCLUSIVE → aggregate</w:t>
-      </w:r>
-      <w:r>
-        <w:t xml:space="preserve"> </w:t>
-      </w:r>
-      <w:r>
-        <w:rPr>
-          <w:bCs/>
-          <w:b/>
-        </w:rPr>
-        <w:t xml:space="preserve">HOLD</w:t>
-      </w:r>
-      <w:r>
-        <w:t xml:space="preserve">.</w:t>
+        <w:t xml:space="preserve">Aggregate ExecutionProof verdict:</w:t>
+      </w:r>
+      <w:r>
+        <w:t xml:space="preserve"> </w:t>
+      </w:r>
+      <w:r>
+        <w:rPr>
+          <w:bCs/>
+          <w:b/>
+        </w:rPr>
+        <w:t xml:space="preserve">ALLOW</w:t>
+      </w:r>
+      <w:r>
+        <w:t xml:space="preserve"> </w:t>
+      </w:r>
+      <w:r>
+        <w:t xml:space="preserve">·</w:t>
+      </w:r>
+      <w:r>
+        <w:t xml:space="preserve"> </w:t>
+      </w:r>
+      <w:r>
+        <w:rPr>
+          <w:rStyle w:val="VerbatimChar"/>
+        </w:rPr>
+        <w:t xml:space="preserve">trinity_certified = True</w:t>
       </w:r>
     </w:p>
     <w:p>
       <w:pPr>
         <w:numPr>
-          <w:ilvl w:val="1"/>
+          <w:ilvl w:val="0"/>
           <w:numId w:val="1003"/>
         </w:numPr>
         <w:pStyle w:val="Compact"/>
       </w:pPr>
       <w:r>
-        <w:rPr>
-          <w:bCs/>
-          <w:b/>
-        </w:rPr>
-        <w:t xml:space="preserve">DENY</w:t>
-      </w:r>
-      <w:r>
-        <w:t xml:space="preserve"> </w:t>
-      </w:r>
-      <w:r>
-        <w:t xml:space="preserve">scenario → device 3 driven below classical (INVALID) → aggregate</w:t>
-      </w:r>
-      <w:r>
-        <w:t xml:space="preserve"> </w:t>
-      </w:r>
-      <w:r>
-        <w:rPr>
-          <w:bCs/>
-          <w:b/>
-        </w:rPr>
-        <w:t xml:space="preserve">DENY</w:t>
-      </w:r>
-      <w:r>
-        <w:t xml:space="preserve">.</w:t>
+        <w:t xml:space="preserve">TRINITY nonce:</w:t>
+      </w:r>
+      <w:r>
+        <w:t xml:space="preserve"> </w:t>
+      </w:r>
+      <w:r>
+        <w:rPr>
+          <w:rStyle w:val="VerbatimChar"/>
+        </w:rPr>
+        <w:t xml:space="preserve">508f0ad692a7bd3a1d1a069aa02f4dc2519560153f646220f2150bbe47270e2f</w:t>
       </w:r>
     </w:p>
     <w:p>
       <w:pPr>
         <w:numPr>
-          <w:ilvl w:val="1"/>
+          <w:ilvl w:val="0"/>
           <w:numId w:val="1003"/>
         </w:numPr>
         <w:pStyle w:val="Compact"/>
       </w:pPr>
       <w:r>
-        <w:rPr>
-          <w:bCs/>
-          <w:b/>
-        </w:rPr>
-        <w:t xml:space="preserve">Tamper test</w:t>
-      </w:r>
-      <w:r>
-        <w:t xml:space="preserve"> </w:t>
-      </w:r>
-      <w:r>
-        <w:t xml:space="preserve">→ altering one raw count without recomputing the hash → verifier recomputes</w:t>
-      </w:r>
-      <w:r>
-        <w:t xml:space="preserve"> </w:t>
-      </w:r>
-      <w:r>
-        <w:rPr>
-          <w:bCs/>
-          <w:b/>
-        </w:rPr>
-        <w:t xml:space="preserve">DENY</w:t>
-      </w:r>
-      <w:r>
-        <w:t xml:space="preserve"> </w:t>
-      </w:r>
-      <w:r>
-        <w:t xml:space="preserve">and reports</w:t>
-      </w:r>
-      <w:r>
-        <w:t xml:space="preserve"> </w:t>
-      </w:r>
-      <w:r>
-        <w:rPr>
-          <w:bCs/>
-          <w:b/>
-        </w:rPr>
-        <w:t xml:space="preserve">FAIL</w:t>
-      </w:r>
-      <w:r>
-        <w:t xml:space="preserve"> </w:t>
-      </w:r>
-      <w:r>
-        <w:t xml:space="preserve">(record_hash mismatch caught).</w:t>
+        <w:t xml:space="preserve">Record hash:</w:t>
+      </w:r>
+      <w:r>
+        <w:t xml:space="preserve"> </w:t>
+      </w:r>
+      <w:r>
+        <w:rPr>
+          <w:rStyle w:val="VerbatimChar"/>
+        </w:rPr>
+        <w:t xml:space="preserve">8d23accac81791fa10f1dba1be79a132168966c4620fc42d16de656bcf9d688b</w:t>
       </w:r>
     </w:p>
     <w:p>
       <w:pPr>
         <w:numPr>
-          <w:ilvl w:val="1"/>
+          <w:ilvl w:val="0"/>
           <w:numId w:val="1003"/>
         </w:numPr>
         <w:pStyle w:val="Compact"/>
       </w:pPr>
       <w:r>
-        <w:rPr>
-          <w:bCs/>
-          <w:b/>
-        </w:rPr>
-        <w:t xml:space="preserve">Manifest-lock test</w:t>
-      </w:r>
-      <w:r>
-        <w:t xml:space="preserve"> </w:t>
-      </w:r>
-      <w:r>
-        <w:t xml:space="preserve">→ editing the harness after locking broke the declared hash →</w:t>
-      </w:r>
-      <w:r>
-        <w:t xml:space="preserve"> </w:t>
-      </w:r>
-      <w:r>
-        <w:t xml:space="preserve">provenance invalid →</w:t>
-      </w:r>
-      <w:r>
-        <w:t xml:space="preserve"> </w:t>
-      </w:r>
-      <w:r>
-        <w:rPr>
-          <w:bCs/>
-          <w:b/>
-        </w:rPr>
-        <w:t xml:space="preserve">DENY</w:t>
-      </w:r>
-      <w:r>
-        <w:t xml:space="preserve"> </w:t>
-      </w:r>
-      <w:r>
-        <w:t xml:space="preserve">(the lock works).</w:t>
+        <w:t xml:space="preserve">Chain — previous record (OMNI-1):</w:t>
+      </w:r>
+      <w:r>
+        <w:t xml:space="preserve"> </w:t>
+      </w:r>
+      <w:r>
+        <w:rPr>
+          <w:rStyle w:val="VerbatimChar"/>
+        </w:rPr>
+        <w:t xml:space="preserve">22ffb2ba137c89c2846225c6d5a11fb2a4dc6aaa6a0ba1dfe6864bc50393bb0c</w:t>
       </w:r>
     </w:p>
     <w:p>
       <w:pPr>
         <w:numPr>
           <w:ilvl w:val="0"/>
-          <w:numId w:val="1002"/>
+          <w:numId w:val="1003"/>
         </w:numPr>
         <w:pStyle w:val="Compact"/>
       </w:pPr>
       <w:r>
-        <w:t xml:space="preserve">☒</w:t>
-      </w:r>
-      <w:r>
-        <w:t xml:space="preserve"> </w:t>
-      </w:r>
-      <w:r>
-        <w:rPr>
-          <w:bCs/>
-          <w:b/>
-        </w:rPr>
-        <w:t xml:space="preserve">Hardware run</w:t>
-      </w:r>
-      <w:r>
-        <w:t xml:space="preserve"> </w:t>
-      </w:r>
-      <w:r>
-        <w:t xml:space="preserve">on</w:t>
+        <w:t xml:space="preserve">NIST beacon pulse:</w:t>
       </w:r>
       <w:r>
         <w:t xml:space="preserve"> </w:t>
@@ -1198,13 +2109,47 @@
         <w:rPr>
           <w:rStyle w:val="VerbatimChar"/>
         </w:rPr>
-        <w:t xml:space="preserve">ibm_kingston</w:t>
-      </w:r>
-      <w:r>
-        <w:t xml:space="preserve"> </w:t>
-      </w:r>
-      <w:r>
-        <w:t xml:space="preserve">+</w:t>
+        <w:t xml:space="preserve">1865761</w:t>
+      </w:r>
+      <w:r>
+        <w:t xml:space="preserve"> </w:t>
+      </w:r>
+      <w:r>
+        <w:t xml:space="preserve">@ 2026-07-19T03:21:00.000Z</w:t>
+      </w:r>
+    </w:p>
+    <w:p>
+      <w:pPr>
+        <w:numPr>
+          <w:ilvl w:val="0"/>
+          <w:numId w:val="1003"/>
+        </w:numPr>
+        <w:pStyle w:val="Compact"/>
+      </w:pPr>
+      <w:r>
+        <w:t xml:space="preserve">Shots: 4,000 per circuit × 4 circuits × 3 devices =</w:t>
+      </w:r>
+      <w:r>
+        <w:t xml:space="preserve"> </w:t>
+      </w:r>
+      <w:r>
+        <w:rPr>
+          <w:bCs/>
+          <w:b/>
+        </w:rPr>
+        <w:t xml:space="preserve">48,000</w:t>
+      </w:r>
+      <w:r>
+        <w:t xml:space="preserve"> </w:t>
+      </w:r>
+      <w:r>
+        <w:t xml:space="preserve">total (matches prereg + locked</w:t>
+      </w:r>
+      <w:r>
+        <w:t xml:space="preserve"> </w:t>
+      </w:r>
+      <w:r>
+        <w:t xml:space="preserve">harness</w:t>
       </w:r>
       <w:r>
         <w:t xml:space="preserve"> </w:t>
@@ -1213,70 +2158,51 @@
         <w:rPr>
           <w:rStyle w:val="VerbatimChar"/>
         </w:rPr>
-        <w:t xml:space="preserve">ibm_fez</w:t>
-      </w:r>
-      <w:r>
-        <w:t xml:space="preserve"> </w:t>
-      </w:r>
-      <w:r>
-        <w:t xml:space="preserve">+</w:t>
-      </w:r>
-      <w:r>
-        <w:t xml:space="preserve"> </w:t>
-      </w:r>
-      <w:r>
-        <w:rPr>
-          <w:rStyle w:val="VerbatimChar"/>
-        </w:rPr>
-        <w:t xml:space="preserve">ibm_marrakesh</w:t>
-      </w:r>
-      <w:r>
-        <w:t xml:space="preserve"> </w:t>
-      </w:r>
-      <w:r>
-        <w:t xml:space="preserve">— genuine CHSH</w:t>
-      </w:r>
-      <w:r>
-        <w:t xml:space="preserve"> </w:t>
-      </w:r>
-      <w:r>
-        <w:t xml:space="preserve">violation on all three, aggregate</w:t>
-      </w:r>
-      <w:r>
-        <w:t xml:space="preserve"> </w:t>
-      </w:r>
-      <w:r>
-        <w:rPr>
-          <w:bCs/>
-          <w:b/>
-        </w:rPr>
-        <w:t xml:space="preserve">ALLOW</w:t>
-      </w:r>
-      <w:r>
-        <w:t xml:space="preserve">, verifier</w:t>
-      </w:r>
-      <w:r>
-        <w:t xml:space="preserve"> </w:t>
-      </w:r>
-      <w:r>
-        <w:rPr>
-          <w:bCs/>
-          <w:b/>
-        </w:rPr>
-        <w:t xml:space="preserve">PASS</w:t>
-      </w:r>
-      <w:r>
-        <w:t xml:space="preserve">.</w:t>
-      </w:r>
-    </w:p>
-    <w:bookmarkEnd w:id="21"/>
-    <w:bookmarkStart w:id="22" w:name="X849d654b6e0fd125ad29eab55db743b57cdf866"/>
+        <w:t xml:space="preserve">--shots</w:t>
+      </w:r>
+      <w:r>
+        <w:t xml:space="preserve"> </w:t>
+      </w:r>
+      <w:r>
+        <w:t xml:space="preserve">default; OMNI shot-count-consistency lesson honored).</w:t>
+      </w:r>
+    </w:p>
+    <w:p>
+      <w:pPr>
+        <w:numPr>
+          <w:ilvl w:val="0"/>
+          <w:numId w:val="1003"/>
+        </w:numPr>
+        <w:pStyle w:val="Compact"/>
+      </w:pPr>
+      <w:r>
+        <w:rPr>
+          <w:bCs/>
+          <w:b/>
+        </w:rPr>
+        <w:t xml:space="preserve">Independent verifier: PASS</w:t>
+      </w:r>
+      <w:r>
+        <w:t xml:space="preserve"> </w:t>
+      </w:r>
+      <w:r>
+        <w:t xml:space="preserve">(recomputes every S, verdict, witness hash, nonce, record</w:t>
+      </w:r>
+      <w:r>
+        <w:t xml:space="preserve"> </w:t>
+      </w:r>
+      <w:r>
+        <w:t xml:space="preserve">hash, and the aggregate verdict from raw counts — no qiskit).</w:t>
+      </w:r>
+    </w:p>
+    <w:bookmarkEnd w:id="24"/>
+    <w:bookmarkStart w:id="25" w:name="completed"/>
     <w:p>
       <w:pPr>
         <w:pStyle w:val="Heading2"/>
       </w:pPr>
       <w:r>
-        <w:t xml:space="preserve">Scope &amp; honesty (unchanged from preregistration)</w:t>
+        <w:t xml:space="preserve">Completed</w:t>
       </w:r>
     </w:p>
     <w:p>
@@ -1288,6 +2214,639 @@
         <w:pStyle w:val="Compact"/>
       </w:pPr>
       <w:r>
+        <w:t xml:space="preserve">☒</w:t>
+      </w:r>
+      <w:r>
+        <w:t xml:space="preserve"> </w:t>
+      </w:r>
+      <w:r>
+        <w:rPr>
+          <w:bCs/>
+          <w:b/>
+        </w:rPr>
+        <w:t xml:space="preserve">Preregistration</w:t>
+      </w:r>
+      <w:r>
+        <w:t xml:space="preserve"> </w:t>
+      </w:r>
+      <w:r>
+        <w:t xml:space="preserve">(</w:t>
+      </w:r>
+      <w:r>
+        <w:rPr>
+          <w:rStyle w:val="VerbatimChar"/>
+        </w:rPr>
+        <w:t xml:space="preserve">TRINITY-1-preregistration.md</w:t>
+      </w:r>
+      <w:r>
+        <w:t xml:space="preserve">) — three-processor design, identical</w:t>
+      </w:r>
+      <w:r>
+        <w:t xml:space="preserve"> </w:t>
+      </w:r>
+      <w:r>
+        <w:t xml:space="preserve">CHSH witness, per-device + aggregate verdict logic (ALLOW/HOLD/DENY/GATE-STOP), fused</w:t>
+      </w:r>
+      <w:r>
+        <w:t xml:space="preserve"> </w:t>
+      </w:r>
+      <w:r>
+        <w:rPr>
+          <w:rStyle w:val="VerbatimChar"/>
+        </w:rPr>
+        <w:t xml:space="preserve">trinity_nonce</w:t>
+      </w:r>
+      <w:r>
+        <w:t xml:space="preserve">, kill condition, hardware gate, scope/honesty caveats, purpose gate.</w:t>
+      </w:r>
+    </w:p>
+    <w:p>
+      <w:pPr>
+        <w:numPr>
+          <w:ilvl w:val="0"/>
+          <w:numId w:val="1004"/>
+        </w:numPr>
+        <w:pStyle w:val="Compact"/>
+      </w:pPr>
+      <w:r>
+        <w:t xml:space="preserve">☒</w:t>
+      </w:r>
+      <w:r>
+        <w:t xml:space="preserve"> </w:t>
+      </w:r>
+      <w:r>
+        <w:rPr>
+          <w:bCs/>
+          <w:b/>
+        </w:rPr>
+        <w:t xml:space="preserve">Harness</w:t>
+      </w:r>
+      <w:r>
+        <w:t xml:space="preserve"> </w:t>
+      </w:r>
+      <w:r>
+        <w:t xml:space="preserve">(</w:t>
+      </w:r>
+      <w:r>
+        <w:rPr>
+          <w:rStyle w:val="VerbatimChar"/>
+        </w:rPr>
+        <w:t xml:space="preserve">trinity_harness.py</w:t>
+      </w:r>
+      <w:r>
+        <w:t xml:space="preserve">) — builds the CHSH witness, runs three independent</w:t>
+      </w:r>
+      <w:r>
+        <w:t xml:space="preserve"> </w:t>
+      </w:r>
+      <w:r>
+        <w:t xml:space="preserve">devices (simulator or hardware), assembles the</w:t>
+      </w:r>
+      <w:r>
+        <w:t xml:space="preserve"> </w:t>
+      </w:r>
+      <w:r>
+        <w:rPr>
+          <w:rStyle w:val="VerbatimChar"/>
+        </w:rPr>
+        <w:t xml:space="preserve">trinity-proofrecord-1.0</w:t>
+      </w:r>
+      <w:r>
+        <w:t xml:space="preserve"> </w:t>
+      </w:r>
+      <w:r>
+        <w:t xml:space="preserve">record, computes</w:t>
+      </w:r>
+      <w:r>
+        <w:t xml:space="preserve"> </w:t>
+      </w:r>
+      <w:r>
+        <w:t xml:space="preserve">the aggregate ExecutionProof verdict, writes report + JSON. Records the</w:t>
+      </w:r>
+      <w:r>
+        <w:t xml:space="preserve"> </w:t>
+      </w:r>
+      <w:r>
+        <w:rPr>
+          <w:bCs/>
+          <w:b/>
+        </w:rPr>
+        <w:t xml:space="preserve">actual physical</w:t>
+      </w:r>
+      <w:r>
+        <w:rPr>
+          <w:bCs/>
+          <w:b/>
+        </w:rPr>
+        <w:t xml:space="preserve"> </w:t>
+      </w:r>
+      <w:r>
+        <w:rPr>
+          <w:bCs/>
+          <w:b/>
+        </w:rPr>
+        <w:t xml:space="preserve">qubits</w:t>
+      </w:r>
+      <w:r>
+        <w:t xml:space="preserve"> </w:t>
+      </w:r>
+      <w:r>
+        <w:t xml:space="preserve">used after transpilation per circuit (post-layout).</w:t>
+      </w:r>
+    </w:p>
+    <w:p>
+      <w:pPr>
+        <w:numPr>
+          <w:ilvl w:val="0"/>
+          <w:numId w:val="1004"/>
+        </w:numPr>
+        <w:pStyle w:val="Compact"/>
+      </w:pPr>
+      <w:r>
+        <w:t xml:space="preserve">☒</w:t>
+      </w:r>
+      <w:r>
+        <w:t xml:space="preserve"> </w:t>
+      </w:r>
+      <w:r>
+        <w:rPr>
+          <w:bCs/>
+          <w:b/>
+        </w:rPr>
+        <w:t xml:space="preserve">Independent verifier</w:t>
+      </w:r>
+      <w:r>
+        <w:t xml:space="preserve"> </w:t>
+      </w:r>
+      <w:r>
+        <w:t xml:space="preserve">(</w:t>
+      </w:r>
+      <w:r>
+        <w:rPr>
+          <w:rStyle w:val="VerbatimChar"/>
+        </w:rPr>
+        <w:t xml:space="preserve">trinity_verify.py</w:t>
+      </w:r>
+      <w:r>
+        <w:t xml:space="preserve">) — reconstructs every device S, verdict,</w:t>
+      </w:r>
+      <w:r>
+        <w:t xml:space="preserve"> </w:t>
+      </w:r>
+      <w:r>
+        <w:rPr>
+          <w:rStyle w:val="VerbatimChar"/>
+        </w:rPr>
+        <w:t xml:space="preserve">device_witness_hash</w:t>
+      </w:r>
+      <w:r>
+        <w:t xml:space="preserve">,</w:t>
+      </w:r>
+      <w:r>
+        <w:t xml:space="preserve"> </w:t>
+      </w:r>
+      <w:r>
+        <w:rPr>
+          <w:rStyle w:val="VerbatimChar"/>
+        </w:rPr>
+        <w:t xml:space="preserve">trinity_nonce</w:t>
+      </w:r>
+      <w:r>
+        <w:t xml:space="preserve">, and</w:t>
+      </w:r>
+      <w:r>
+        <w:t xml:space="preserve"> </w:t>
+      </w:r>
+      <w:r>
+        <w:rPr>
+          <w:rStyle w:val="VerbatimChar"/>
+        </w:rPr>
+        <w:t xml:space="preserve">record_hash</w:t>
+      </w:r>
+      <w:r>
+        <w:t xml:space="preserve"> </w:t>
+      </w:r>
+      <w:r>
+        <w:t xml:space="preserve">from raw counts, no qiskit.</w:t>
+      </w:r>
+    </w:p>
+    <w:p>
+      <w:pPr>
+        <w:numPr>
+          <w:ilvl w:val="0"/>
+          <w:numId w:val="1004"/>
+        </w:numPr>
+        <w:pStyle w:val="Compact"/>
+      </w:pPr>
+      <w:r>
+        <w:t xml:space="preserve">☒</w:t>
+      </w:r>
+      <w:r>
+        <w:t xml:space="preserve"> </w:t>
+      </w:r>
+      <w:r>
+        <w:rPr>
+          <w:bCs/>
+          <w:b/>
+        </w:rPr>
+        <w:t xml:space="preserve">Preregistration + harness lock</w:t>
+      </w:r>
+      <w:r>
+        <w:t xml:space="preserve"> </w:t>
+      </w:r>
+      <w:r>
+        <w:t xml:space="preserve">(</w:t>
+      </w:r>
+      <w:r>
+        <w:rPr>
+          <w:rStyle w:val="VerbatimChar"/>
+        </w:rPr>
+        <w:t xml:space="preserve">MANIFEST.sha256</w:t>
+      </w:r>
+      <w:r>
+        <w:t xml:space="preserve">) — SHA-256, re-verified</w:t>
+      </w:r>
+      <w:r>
+        <w:t xml:space="preserve"> </w:t>
+      </w:r>
+      <w:r>
+        <w:rPr>
+          <w:rStyle w:val="VerbatimChar"/>
+        </w:rPr>
+        <w:t xml:space="preserve">OK</w:t>
+      </w:r>
+      <w:r>
+        <w:t xml:space="preserve">.</w:t>
+      </w:r>
+    </w:p>
+    <w:p>
+      <w:pPr>
+        <w:numPr>
+          <w:ilvl w:val="0"/>
+          <w:numId w:val="1004"/>
+        </w:numPr>
+        <w:pStyle w:val="Compact"/>
+      </w:pPr>
+      <w:r>
+        <w:t xml:space="preserve">☒</w:t>
+      </w:r>
+      <w:r>
+        <w:t xml:space="preserve"> </w:t>
+      </w:r>
+      <w:r>
+        <w:rPr>
+          <w:bCs/>
+          <w:b/>
+        </w:rPr>
+        <w:t xml:space="preserve">Simulator validation</w:t>
+      </w:r>
+      <w:r>
+        <w:t xml:space="preserve"> </w:t>
+      </w:r>
+      <w:r>
+        <w:t xml:space="preserve">— three independent noisy aer backends:</w:t>
+      </w:r>
+    </w:p>
+    <w:p>
+      <w:pPr>
+        <w:numPr>
+          <w:ilvl w:val="1"/>
+          <w:numId w:val="1005"/>
+        </w:numPr>
+        <w:pStyle w:val="Compact"/>
+      </w:pPr>
+      <w:r>
+        <w:rPr>
+          <w:bCs/>
+          <w:b/>
+        </w:rPr>
+        <w:t xml:space="preserve">NOMINAL</w:t>
+      </w:r>
+      <w:r>
+        <w:t xml:space="preserve"> </w:t>
+      </w:r>
+      <w:r>
+        <w:t xml:space="preserve">→ all three VALID_ABOVE →</w:t>
+      </w:r>
+      <w:r>
+        <w:t xml:space="preserve"> </w:t>
+      </w:r>
+      <w:r>
+        <w:rPr>
+          <w:bCs/>
+          <w:b/>
+        </w:rPr>
+        <w:t xml:space="preserve">ALLOW</w:t>
+      </w:r>
+      <w:r>
+        <w:t xml:space="preserve">; verifier</w:t>
+      </w:r>
+      <w:r>
+        <w:t xml:space="preserve"> </w:t>
+      </w:r>
+      <w:r>
+        <w:rPr>
+          <w:bCs/>
+          <w:b/>
+        </w:rPr>
+        <w:t xml:space="preserve">PASS</w:t>
+      </w:r>
+      <w:r>
+        <w:t xml:space="preserve">.</w:t>
+      </w:r>
+    </w:p>
+    <w:p>
+      <w:pPr>
+        <w:numPr>
+          <w:ilvl w:val="1"/>
+          <w:numId w:val="1005"/>
+        </w:numPr>
+        <w:pStyle w:val="Compact"/>
+      </w:pPr>
+      <w:r>
+        <w:rPr>
+          <w:bCs/>
+          <w:b/>
+        </w:rPr>
+        <w:t xml:space="preserve">HOLD</w:t>
+      </w:r>
+      <w:r>
+        <w:t xml:space="preserve"> </w:t>
+      </w:r>
+      <w:r>
+        <w:t xml:space="preserve">scenario → device 3 driven to INCONCLUSIVE → aggregate</w:t>
+      </w:r>
+      <w:r>
+        <w:t xml:space="preserve"> </w:t>
+      </w:r>
+      <w:r>
+        <w:rPr>
+          <w:bCs/>
+          <w:b/>
+        </w:rPr>
+        <w:t xml:space="preserve">HOLD</w:t>
+      </w:r>
+      <w:r>
+        <w:t xml:space="preserve">.</w:t>
+      </w:r>
+    </w:p>
+    <w:p>
+      <w:pPr>
+        <w:numPr>
+          <w:ilvl w:val="1"/>
+          <w:numId w:val="1005"/>
+        </w:numPr>
+        <w:pStyle w:val="Compact"/>
+      </w:pPr>
+      <w:r>
+        <w:rPr>
+          <w:bCs/>
+          <w:b/>
+        </w:rPr>
+        <w:t xml:space="preserve">DENY</w:t>
+      </w:r>
+      <w:r>
+        <w:t xml:space="preserve"> </w:t>
+      </w:r>
+      <w:r>
+        <w:t xml:space="preserve">scenario → device 3 driven below classical (INVALID) → aggregate</w:t>
+      </w:r>
+      <w:r>
+        <w:t xml:space="preserve"> </w:t>
+      </w:r>
+      <w:r>
+        <w:rPr>
+          <w:bCs/>
+          <w:b/>
+        </w:rPr>
+        <w:t xml:space="preserve">DENY</w:t>
+      </w:r>
+      <w:r>
+        <w:t xml:space="preserve">.</w:t>
+      </w:r>
+    </w:p>
+    <w:p>
+      <w:pPr>
+        <w:numPr>
+          <w:ilvl w:val="1"/>
+          <w:numId w:val="1005"/>
+        </w:numPr>
+        <w:pStyle w:val="Compact"/>
+      </w:pPr>
+      <w:r>
+        <w:rPr>
+          <w:bCs/>
+          <w:b/>
+        </w:rPr>
+        <w:t xml:space="preserve">Tamper test</w:t>
+      </w:r>
+      <w:r>
+        <w:t xml:space="preserve"> </w:t>
+      </w:r>
+      <w:r>
+        <w:t xml:space="preserve">→ altering one raw count without recomputing the hash → verifier recomputes</w:t>
+      </w:r>
+      <w:r>
+        <w:t xml:space="preserve"> </w:t>
+      </w:r>
+      <w:r>
+        <w:rPr>
+          <w:bCs/>
+          <w:b/>
+        </w:rPr>
+        <w:t xml:space="preserve">DENY</w:t>
+      </w:r>
+      <w:r>
+        <w:t xml:space="preserve"> </w:t>
+      </w:r>
+      <w:r>
+        <w:t xml:space="preserve">and reports</w:t>
+      </w:r>
+      <w:r>
+        <w:t xml:space="preserve"> </w:t>
+      </w:r>
+      <w:r>
+        <w:rPr>
+          <w:bCs/>
+          <w:b/>
+        </w:rPr>
+        <w:t xml:space="preserve">FAIL</w:t>
+      </w:r>
+      <w:r>
+        <w:t xml:space="preserve"> </w:t>
+      </w:r>
+      <w:r>
+        <w:t xml:space="preserve">(record_hash mismatch caught).</w:t>
+      </w:r>
+    </w:p>
+    <w:p>
+      <w:pPr>
+        <w:numPr>
+          <w:ilvl w:val="1"/>
+          <w:numId w:val="1005"/>
+        </w:numPr>
+        <w:pStyle w:val="Compact"/>
+      </w:pPr>
+      <w:r>
+        <w:rPr>
+          <w:bCs/>
+          <w:b/>
+        </w:rPr>
+        <w:t xml:space="preserve">Manifest-lock test</w:t>
+      </w:r>
+      <w:r>
+        <w:t xml:space="preserve"> </w:t>
+      </w:r>
+      <w:r>
+        <w:t xml:space="preserve">→ editing the harness after locking broke the declared hash →</w:t>
+      </w:r>
+      <w:r>
+        <w:t xml:space="preserve"> </w:t>
+      </w:r>
+      <w:r>
+        <w:t xml:space="preserve">provenance invalid →</w:t>
+      </w:r>
+      <w:r>
+        <w:t xml:space="preserve"> </w:t>
+      </w:r>
+      <w:r>
+        <w:rPr>
+          <w:bCs/>
+          <w:b/>
+        </w:rPr>
+        <w:t xml:space="preserve">DENY</w:t>
+      </w:r>
+      <w:r>
+        <w:t xml:space="preserve"> </w:t>
+      </w:r>
+      <w:r>
+        <w:t xml:space="preserve">(the lock works).</w:t>
+      </w:r>
+    </w:p>
+    <w:p>
+      <w:pPr>
+        <w:numPr>
+          <w:ilvl w:val="0"/>
+          <w:numId w:val="1004"/>
+        </w:numPr>
+        <w:pStyle w:val="Compact"/>
+      </w:pPr>
+      <w:r>
+        <w:t xml:space="preserve">☒</w:t>
+      </w:r>
+      <w:r>
+        <w:t xml:space="preserve"> </w:t>
+      </w:r>
+      <w:r>
+        <w:rPr>
+          <w:bCs/>
+          <w:b/>
+        </w:rPr>
+        <w:t xml:space="preserve">Hardware run</w:t>
+      </w:r>
+      <w:r>
+        <w:t xml:space="preserve"> </w:t>
+      </w:r>
+      <w:r>
+        <w:t xml:space="preserve">on</w:t>
+      </w:r>
+      <w:r>
+        <w:t xml:space="preserve"> </w:t>
+      </w:r>
+      <w:r>
+        <w:rPr>
+          <w:rStyle w:val="VerbatimChar"/>
+        </w:rPr>
+        <w:t xml:space="preserve">ibm_kingston</w:t>
+      </w:r>
+      <w:r>
+        <w:t xml:space="preserve"> </w:t>
+      </w:r>
+      <w:r>
+        <w:t xml:space="preserve">+</w:t>
+      </w:r>
+      <w:r>
+        <w:t xml:space="preserve"> </w:t>
+      </w:r>
+      <w:r>
+        <w:rPr>
+          <w:rStyle w:val="VerbatimChar"/>
+        </w:rPr>
+        <w:t xml:space="preserve">ibm_fez</w:t>
+      </w:r>
+      <w:r>
+        <w:t xml:space="preserve"> </w:t>
+      </w:r>
+      <w:r>
+        <w:t xml:space="preserve">+</w:t>
+      </w:r>
+      <w:r>
+        <w:t xml:space="preserve"> </w:t>
+      </w:r>
+      <w:r>
+        <w:rPr>
+          <w:rStyle w:val="VerbatimChar"/>
+        </w:rPr>
+        <w:t xml:space="preserve">ibm_marrakesh</w:t>
+      </w:r>
+      <w:r>
+        <w:t xml:space="preserve"> </w:t>
+      </w:r>
+      <w:r>
+        <w:t xml:space="preserve">— genuine CHSH</w:t>
+      </w:r>
+      <w:r>
+        <w:t xml:space="preserve"> </w:t>
+      </w:r>
+      <w:r>
+        <w:t xml:space="preserve">violation on all three, aggregate</w:t>
+      </w:r>
+      <w:r>
+        <w:t xml:space="preserve"> </w:t>
+      </w:r>
+      <w:r>
+        <w:rPr>
+          <w:bCs/>
+          <w:b/>
+        </w:rPr>
+        <w:t xml:space="preserve">ALLOW</w:t>
+      </w:r>
+      <w:r>
+        <w:t xml:space="preserve">, verifier</w:t>
+      </w:r>
+      <w:r>
+        <w:t xml:space="preserve"> </w:t>
+      </w:r>
+      <w:r>
+        <w:rPr>
+          <w:bCs/>
+          <w:b/>
+        </w:rPr>
+        <w:t xml:space="preserve">PASS</w:t>
+      </w:r>
+      <w:r>
+        <w:t xml:space="preserve">.</w:t>
+      </w:r>
+    </w:p>
+    <w:bookmarkEnd w:id="25"/>
+    <w:bookmarkStart w:id="26" w:name="X849d654b6e0fd125ad29eab55db743b57cdf866"/>
+    <w:p>
+      <w:pPr>
+        <w:pStyle w:val="Heading2"/>
+      </w:pPr>
+      <w:r>
+        <w:t xml:space="preserve">Scope &amp; honesty (unchanged from preregistration)</w:t>
+      </w:r>
+    </w:p>
+    <w:p>
+      <w:pPr>
+        <w:numPr>
+          <w:ilvl w:val="0"/>
+          <w:numId w:val="1006"/>
+        </w:numPr>
+        <w:pStyle w:val="Compact"/>
+      </w:pPr>
+      <w:r>
         <w:t xml:space="preserve">This is a</w:t>
       </w:r>
       <w:r>
@@ -1367,8 +2926,8 @@
         <w:t xml:space="preserve">CHSH experiment; TRINITY is the reproduction + fusion claim, nothing more.</w:t>
       </w:r>
     </w:p>
-    <w:bookmarkEnd w:id="22"/>
-    <w:bookmarkStart w:id="23" w:name="provenance-reproducibility"/>
+    <w:bookmarkEnd w:id="26"/>
+    <w:bookmarkStart w:id="27" w:name="provenance-reproducibility"/>
     <w:p>
       <w:pPr>
         <w:pStyle w:val="Heading2"/>
@@ -1448,8 +3007,8 @@
         <w:t xml:space="preserve"># independent reconstruction from raw counts → PASS</w:t>
       </w:r>
     </w:p>
-    <w:bookmarkEnd w:id="23"/>
-    <w:bookmarkStart w:id="24" w:name="security-note"/>
+    <w:bookmarkEnd w:id="27"/>
+    <w:bookmarkStart w:id="28" w:name="security-note"/>
     <w:p>
       <w:pPr>
         <w:pStyle w:val="Heading2"/>
@@ -1533,8 +3092,8 @@
         <w:t xml:space="preserve">).</w:t>
       </w:r>
     </w:p>
-    <w:bookmarkEnd w:id="24"/>
-    <w:bookmarkEnd w:id="25"/>
+    <w:bookmarkEnd w:id="28"/>
+    <w:bookmarkEnd w:id="29"/>
     <w:sectPr/>
   </w:body>
 </w:document>
@@ -1730,6 +3289,12 @@
     <w:abstractNumId w:val="991"/>
   </w:num>
   <w:num w:numId="1004">
+    <w:abstractNumId w:val="991"/>
+  </w:num>
+  <w:num w:numId="1005">
+    <w:abstractNumId w:val="991"/>
+  </w:num>
+  <w:num w:numId="1006">
     <w:abstractNumId w:val="991"/>
   </w:num>
 </w:numbering>

</xml_diff>

<commit_message>
TRINITY-2 PUBLISHED to Zenodo: concept DOI 10.5281/zenodo.21438244, v1 21438245
Record live (state=done), 10 files. STATUS updated to reflect publication complete.
</commit_message>
<xml_diff>
--- a/STATUS.docx
+++ b/STATUS.docx
@@ -859,13 +859,44 @@
           <w:bCs/>
           <w:b/>
         </w:rPr>
-        <w:t xml:space="preserve">Still open:</w:t>
-      </w:r>
-      <w:r>
-        <w:t xml:space="preserve"> </w:t>
-      </w:r>
-      <w:r>
-        <w:t xml:space="preserve">Zenodo publication (pending a rotated Zenodo token — GitHub push done).</w:t>
+        <w:t xml:space="preserve">PUBLISHED:</w:t>
+      </w:r>
+      <w:r>
+        <w:t xml:space="preserve"> </w:t>
+      </w:r>
+      <w:r>
+        <w:t xml:space="preserve">GitHub</w:t>
+      </w:r>
+      <w:r>
+        <w:t xml:space="preserve"> </w:t>
+      </w:r>
+      <w:r>
+        <w:rPr>
+          <w:rStyle w:val="VerbatimChar"/>
+        </w:rPr>
+        <w:t xml:space="preserve">derekhone/trinity-testbeds</w:t>
+      </w:r>
+      <w:r>
+        <w:t xml:space="preserve"> </w:t>
+      </w:r>
+      <w:r>
+        <w:t xml:space="preserve">+ Zenodo — concept DOI</w:t>
+      </w:r>
+      <w:r>
+        <w:t xml:space="preserve"> </w:t>
+      </w:r>
+      <w:r>
+        <w:rPr>
+          <w:bCs/>
+          <w:b/>
+        </w:rPr>
+        <w:t xml:space="preserve">10.5281/zenodo.21438244</w:t>
+      </w:r>
+      <w:r>
+        <w:t xml:space="preserve"> </w:t>
+      </w:r>
+      <w:r>
+        <w:t xml:space="preserve">(cite this), version v1 DOI 10.5281/zenodo.21438245 (2026-07-19).</w:t>
       </w:r>
     </w:p>
     <w:bookmarkEnd w:id="20"/>

</xml_diff>